<commit_message>
feat(liquidacion): formatos Word y Excel rediseñados en una sola pagina
- Word: encabezado con empresa y periodo, ficha del trabajador en cuadricula,
  haberes y descuentos lado a lado, bases de calculo, liquido a pagar
  destacado, forma de pago y firmas. Cabe en una hoja carta (antes, dos).
- Excel: mismo diseño con las formulas de AFP, salud, cesantia, impuesto
  unico y liquido. Verificado con los tres casos de prueba (sueldo minimo
  $452.917, $1.500.000 Habitat y $4.000.000 Isapre con tope).
- Pagina: descripciones actualizadas y ?v=2 en los enlaces para no servir
  la version en cache.

Co-Authored-By: Claude Opus 5.5 <noreply@anthropic.com>
Claude-Session: https://claude.ai/code/session_01WLXjYYN7g49YRmmeLkdTX3
</commit_message>
<xml_diff>
--- a/descargas/formato-liquidacion-de-sueldo.docx
+++ b/descargas/formato-liquidacion-de-sueldo.docx
@@ -2,402 +2,716 @@
 <file path=word/document.xml><?xml version="1.0" encoding="utf-8"?>
 <w:document xmlns:wpc="http://schemas.microsoft.com/office/word/2010/wordprocessingCanvas" xmlns:mo="http://schemas.microsoft.com/office/mac/office/2008/main" xmlns:mc="http://schemas.openxmlformats.org/markup-compatibility/2006" xmlns:mv="urn:schemas-microsoft-com:mac:vml" xmlns:o="urn:schemas-microsoft-com:office:office" xmlns:r="http://schemas.openxmlformats.org/officeDocument/2006/relationships" xmlns:m="http://schemas.openxmlformats.org/officeDocument/2006/math" xmlns:v="urn:schemas-microsoft-com:vml" xmlns:wp14="http://schemas.microsoft.com/office/word/2010/wordprocessingDrawing" xmlns:wp="http://schemas.openxmlformats.org/drawingml/2006/wordprocessingDrawing" xmlns:w10="urn:schemas-microsoft-com:office:word" xmlns:w="http://schemas.openxmlformats.org/wordprocessingml/2006/main" xmlns:w14="http://schemas.microsoft.com/office/word/2010/wordml" xmlns:wpg="http://schemas.microsoft.com/office/word/2010/wordprocessingGroup" xmlns:wpi="http://schemas.microsoft.com/office/word/2010/wordprocessingInk" xmlns:wne="http://schemas.microsoft.com/office/word/2006/wordml" xmlns:wps="http://schemas.microsoft.com/office/word/2010/wordprocessingShape" mc:Ignorable="w14 wp14">
   <w:body>
-    <w:p>
-      <w:pPr>
-        <w:jc w:val="center"/>
-      </w:pPr>
-      <w:r>
-        <w:rPr>
-          <w:b/>
-          <w:color w:val="00382E"/>
-          <w:sz w:val="30"/>
-        </w:rPr>
-        <w:t>LIQUIDACIÓN DE SUELDO</w:t>
-      </w:r>
-    </w:p>
-    <w:p>
-      <w:pPr>
-        <w:jc w:val="center"/>
-      </w:pPr>
-      <w:r>
-        <w:t>Período: ____________________ de 20____</w:t>
-      </w:r>
-    </w:p>
-    <w:p>
-      <w:pPr>
-        <w:spacing w:before="160" w:after="40"/>
-      </w:pPr>
-      <w:r>
-        <w:rPr>
-          <w:b/>
-          <w:color w:val="00382E"/>
-          <w:sz w:val="19"/>
-        </w:rPr>
-        <w:t>DATOS DEL EMPLEADOR</w:t>
-      </w:r>
-    </w:p>
     <w:tbl>
       <w:tblPr>
-        <w:tblStyle w:val="TableGrid"/>
         <w:tblW w:type="auto" w:w="0"/>
-        <w:jc w:val="center"/>
         <w:tblLook w:firstColumn="1" w:firstRow="1" w:lastColumn="0" w:lastRow="0" w:noHBand="0" w:noVBand="1" w:val="04A0"/>
+        <w:tblBorders>
+          <w:top w:val="nil"/>
+          <w:left w:val="nil"/>
+          <w:bottom w:val="nil"/>
+          <w:right w:val="nil"/>
+          <w:insideH w:val="nil"/>
+          <w:insideV w:val="nil"/>
+        </w:tblBorders>
+        <w:tblLayout w:type="fixed"/>
+        <w:tblCellMar>
+          <w:top w:w="0" w:type="dxa"/>
+          <w:left w:w="0" w:type="dxa"/>
+          <w:bottom w:w="0" w:type="dxa"/>
+          <w:right w:w="0" w:type="dxa"/>
+        </w:tblCellMar>
+        <w:tblLayout w:type="fixed"/>
       </w:tblPr>
       <w:tblGrid>
-        <w:gridCol w:w="4986"/>
-        <w:gridCol w:w="4986"/>
+        <w:gridCol w:w="5896"/>
+        <w:gridCol w:w="4530"/>
       </w:tblGrid>
       <w:tr>
         <w:tc>
           <w:tcPr>
-            <w:tcW w:type="dxa" w:w="6236"/>
+            <w:tcW w:type="dxa" w:w="5896"/>
           </w:tcPr>
           <w:p>
+            <w:pPr>
+              <w:spacing w:before="0" w:after="0" w:line="240" w:lineRule="auto"/>
+            </w:pPr>
+            <w:r>
+              <w:rPr>
+                <w:b/>
+                <w:caps w:val="0"/>
+                <w:color w:val="1E293B"/>
+                <w:sz w:val="22"/>
+              </w:rPr>
+              <w:t>[Razón social de la empresa]</w:t>
+            </w:r>
+          </w:p>
+          <w:p>
+            <w:pPr>
+              <w:spacing w:before="0" w:after="0" w:line="240" w:lineRule="auto"/>
+            </w:pPr>
             <w:r>
               <w:rPr>
                 <w:b w:val="0"/>
+                <w:caps w:val="0"/>
+                <w:color w:val="64748B"/>
+                <w:sz w:val="17"/>
               </w:rPr>
-              <w:t>Razón social</w:t>
+              <w:t>RUT: ____________________</w:t>
+            </w:r>
+          </w:p>
+          <w:p>
+            <w:pPr>
+              <w:spacing w:before="0" w:after="0" w:line="240" w:lineRule="auto"/>
+            </w:pPr>
+            <w:r>
+              <w:rPr>
+                <w:b w:val="0"/>
+                <w:caps w:val="0"/>
+                <w:color w:val="64748B"/>
+                <w:sz w:val="17"/>
+              </w:rPr>
+              <w:t>Dirección: ______________________________________</w:t>
             </w:r>
           </w:p>
         </w:tc>
         <w:tc>
           <w:tcPr>
-            <w:tcW w:type="dxa" w:w="3402"/>
+            <w:tcW w:type="dxa" w:w="4530"/>
           </w:tcPr>
           <w:p>
             <w:pPr>
-              <w:jc w:val="left"/>
+              <w:spacing w:before="0" w:after="0" w:line="240" w:lineRule="auto"/>
+              <w:jc w:val="right"/>
             </w:pPr>
-            <w:r/>
+            <w:r>
+              <w:rPr>
+                <w:b/>
+                <w:caps w:val="0"/>
+                <w:color w:val="00382E"/>
+                <w:sz w:val="28"/>
+              </w:rPr>
+              <w:t>LIQUIDACIÓN DE SUELDO</w:t>
+            </w:r>
+          </w:p>
+          <w:p>
+            <w:pPr>
+              <w:spacing w:before="0" w:after="0" w:line="240" w:lineRule="auto"/>
+              <w:jc w:val="right"/>
+            </w:pPr>
+            <w:r>
+              <w:rPr>
+                <w:b w:val="0"/>
+                <w:caps w:val="0"/>
+                <w:color w:val="64748B"/>
+                <w:sz w:val="18"/>
+              </w:rPr>
+              <w:t>Período: ______________ de 20____</w:t>
+            </w:r>
+          </w:p>
+        </w:tc>
+      </w:tr>
+    </w:tbl>
+    <w:p>
+      <w:pPr>
+        <w:spacing w:before="0" w:after="0" w:line="120" w:lineRule="exact"/>
+      </w:pPr>
+      <w:r>
+        <w:rPr>
+          <w:sz w:val="2"/>
+        </w:rPr>
+      </w:r>
+    </w:p>
+    <w:tbl>
+      <w:tblPr>
+        <w:tblW w:type="auto" w:w="0"/>
+        <w:tblLook w:firstColumn="1" w:firstRow="1" w:lastColumn="0" w:lastRow="0" w:noHBand="0" w:noVBand="1" w:val="04A0"/>
+        <w:tblBorders>
+          <w:top w:val="nil"/>
+          <w:left w:val="nil"/>
+          <w:bottom w:val="nil"/>
+          <w:right w:val="nil"/>
+          <w:insideH w:val="nil"/>
+          <w:insideV w:val="nil"/>
+        </w:tblBorders>
+        <w:tblLayout w:type="fixed"/>
+        <w:tblCellMar>
+          <w:top w:w="0" w:type="dxa"/>
+          <w:left w:w="0" w:type="dxa"/>
+          <w:bottom w:w="0" w:type="dxa"/>
+          <w:right w:w="0" w:type="dxa"/>
+        </w:tblCellMar>
+        <w:tblLayout w:type="fixed"/>
+      </w:tblPr>
+      <w:tblGrid>
+        <w:gridCol w:w="10426"/>
+      </w:tblGrid>
+      <w:tr>
+        <w:tc>
+          <w:tcPr>
+            <w:tcW w:type="dxa" w:w="10426"/>
+            <w:tcBorders>
+              <w:top w:val="single" w:sz="16" w:color="00382E"/>
+              <w:left w:val="nil"/>
+              <w:bottom w:val="nil"/>
+              <w:right w:val="nil"/>
+            </w:tcBorders>
+          </w:tcPr>
+          <w:p>
+            <w:pPr>
+              <w:spacing w:before="0" w:after="0" w:line="240" w:lineRule="auto"/>
+            </w:pPr>
+            <w:r>
+              <w:rPr>
+                <w:b w:val="0"/>
+                <w:caps w:val="0"/>
+                <w:color w:val="1E293B"/>
+                <w:sz w:val="4"/>
+              </w:rPr>
+            </w:r>
+          </w:p>
+        </w:tc>
+      </w:tr>
+    </w:tbl>
+    <w:p>
+      <w:pPr>
+        <w:spacing w:before="0" w:after="0" w:line="80" w:lineRule="exact"/>
+      </w:pPr>
+      <w:r>
+        <w:rPr>
+          <w:sz w:val="2"/>
+        </w:rPr>
+      </w:r>
+    </w:p>
+    <w:tbl>
+      <w:tblPr>
+        <w:tblW w:type="auto" w:w="0"/>
+        <w:tblLook w:firstColumn="1" w:firstRow="1" w:lastColumn="0" w:lastRow="0" w:noHBand="0" w:noVBand="1" w:val="04A0"/>
+        <w:tblBorders>
+          <w:top w:val="nil"/>
+          <w:left w:val="nil"/>
+          <w:bottom w:val="nil"/>
+          <w:right w:val="nil"/>
+          <w:insideH w:val="nil"/>
+          <w:insideV w:val="nil"/>
+        </w:tblBorders>
+        <w:tblLayout w:type="fixed"/>
+        <w:tblCellMar>
+          <w:top w:w="90" w:type="dxa"/>
+          <w:left w:w="110" w:type="dxa"/>
+          <w:bottom w:w="110" w:type="dxa"/>
+          <w:right w:w="90" w:type="dxa"/>
+        </w:tblCellMar>
+        <w:tblLayout w:type="fixed"/>
+      </w:tblPr>
+      <w:tblGrid>
+        <w:gridCol w:w="2606"/>
+        <w:gridCol w:w="2606"/>
+        <w:gridCol w:w="2606"/>
+        <w:gridCol w:w="2606"/>
+      </w:tblGrid>
+      <w:tr>
+        <w:tc>
+          <w:tcPr>
+            <w:tcW w:type="dxa" w:w="2606"/>
+            <w:shd w:val="clear" w:color="auto" w:fill="F1F5F4"/>
+            <w:tcBorders>
+              <w:top w:val="nil"/>
+              <w:left w:val="nil"/>
+              <w:bottom w:val="single" w:sz="4" w:color="D7DEE4"/>
+              <w:right w:val="single" w:sz="4" w:color="D7DEE4"/>
+            </w:tcBorders>
+          </w:tcPr>
+          <w:p>
+            <w:pPr>
+              <w:spacing w:before="0" w:after="0" w:line="240" w:lineRule="auto"/>
+            </w:pPr>
+            <w:r>
+              <w:rPr>
+                <w:b/>
+                <w:caps/>
+                <w:color w:val="64748B"/>
+                <w:sz w:val="13"/>
+              </w:rPr>
+              <w:t>Nombre del trabajador</w:t>
+            </w:r>
+          </w:p>
+          <w:p>
+            <w:pPr>
+              <w:spacing w:before="0" w:after="0" w:line="240" w:lineRule="auto"/>
+            </w:pPr>
+            <w:r>
+              <w:rPr>
+                <w:b w:val="0"/>
+                <w:caps w:val="0"/>
+                <w:color w:val="1E293B"/>
+                <w:sz w:val="18"/>
+              </w:rPr>
+            </w:r>
+          </w:p>
+        </w:tc>
+        <w:tc>
+          <w:tcPr>
+            <w:tcW w:type="dxa" w:w="2606"/>
+            <w:shd w:val="clear" w:color="auto" w:fill="F1F5F4"/>
+            <w:tcBorders>
+              <w:top w:val="nil"/>
+              <w:left w:val="nil"/>
+              <w:bottom w:val="single" w:sz="4" w:color="D7DEE4"/>
+              <w:right w:val="single" w:sz="4" w:color="D7DEE4"/>
+            </w:tcBorders>
+          </w:tcPr>
+          <w:p>
+            <w:pPr>
+              <w:spacing w:before="0" w:after="0" w:line="240" w:lineRule="auto"/>
+            </w:pPr>
+            <w:r>
+              <w:rPr>
+                <w:b/>
+                <w:caps/>
+                <w:color w:val="64748B"/>
+                <w:sz w:val="13"/>
+              </w:rPr>
+              <w:t>RUT</w:t>
+            </w:r>
+          </w:p>
+          <w:p>
+            <w:pPr>
+              <w:spacing w:before="0" w:after="0" w:line="240" w:lineRule="auto"/>
+            </w:pPr>
+            <w:r>
+              <w:rPr>
+                <w:b w:val="0"/>
+                <w:caps w:val="0"/>
+                <w:color w:val="1E293B"/>
+                <w:sz w:val="18"/>
+              </w:rPr>
+            </w:r>
+          </w:p>
+        </w:tc>
+        <w:tc>
+          <w:tcPr>
+            <w:tcW w:type="dxa" w:w="2606"/>
+            <w:shd w:val="clear" w:color="auto" w:fill="F1F5F4"/>
+            <w:tcBorders>
+              <w:top w:val="nil"/>
+              <w:left w:val="nil"/>
+              <w:bottom w:val="single" w:sz="4" w:color="D7DEE4"/>
+              <w:right w:val="single" w:sz="4" w:color="D7DEE4"/>
+            </w:tcBorders>
+          </w:tcPr>
+          <w:p>
+            <w:pPr>
+              <w:spacing w:before="0" w:after="0" w:line="240" w:lineRule="auto"/>
+            </w:pPr>
+            <w:r>
+              <w:rPr>
+                <w:b/>
+                <w:caps/>
+                <w:color w:val="64748B"/>
+                <w:sz w:val="13"/>
+              </w:rPr>
+              <w:t>Cargo</w:t>
+            </w:r>
+          </w:p>
+          <w:p>
+            <w:pPr>
+              <w:spacing w:before="0" w:after="0" w:line="240" w:lineRule="auto"/>
+            </w:pPr>
+            <w:r>
+              <w:rPr>
+                <w:b w:val="0"/>
+                <w:caps w:val="0"/>
+                <w:color w:val="1E293B"/>
+                <w:sz w:val="18"/>
+              </w:rPr>
+            </w:r>
+          </w:p>
+        </w:tc>
+        <w:tc>
+          <w:tcPr>
+            <w:tcW w:type="dxa" w:w="2606"/>
+            <w:shd w:val="clear" w:color="auto" w:fill="F1F5F4"/>
+            <w:tcBorders>
+              <w:top w:val="nil"/>
+              <w:left w:val="nil"/>
+              <w:bottom w:val="single" w:sz="4" w:color="D7DEE4"/>
+              <w:right w:val="nil"/>
+            </w:tcBorders>
+          </w:tcPr>
+          <w:p>
+            <w:pPr>
+              <w:spacing w:before="0" w:after="0" w:line="240" w:lineRule="auto"/>
+            </w:pPr>
+            <w:r>
+              <w:rPr>
+                <w:b/>
+                <w:caps/>
+                <w:color w:val="64748B"/>
+                <w:sz w:val="13"/>
+              </w:rPr>
+              <w:t>Fecha de ingreso</w:t>
+            </w:r>
+          </w:p>
+          <w:p>
+            <w:pPr>
+              <w:spacing w:before="0" w:after="0" w:line="240" w:lineRule="auto"/>
+            </w:pPr>
+            <w:r>
+              <w:rPr>
+                <w:b w:val="0"/>
+                <w:caps w:val="0"/>
+                <w:color w:val="1E293B"/>
+                <w:sz w:val="18"/>
+              </w:rPr>
+            </w:r>
           </w:p>
         </w:tc>
       </w:tr>
       <w:tr>
         <w:tc>
           <w:tcPr>
-            <w:tcW w:type="dxa" w:w="6236"/>
-            <w:shd w:val="clear" w:color="auto" w:fill="FFF4D6"/>
+            <w:tcW w:type="dxa" w:w="2606"/>
+            <w:shd w:val="clear" w:color="auto" w:fill="F1F5F4"/>
+            <w:tcBorders>
+              <w:top w:val="nil"/>
+              <w:left w:val="nil"/>
+              <w:bottom w:val="nil"/>
+              <w:right w:val="single" w:sz="4" w:color="D7DEE4"/>
+            </w:tcBorders>
           </w:tcPr>
           <w:p>
+            <w:pPr>
+              <w:spacing w:before="0" w:after="0" w:line="240" w:lineRule="auto"/>
+            </w:pPr>
             <w:r>
               <w:rPr>
                 <w:b/>
+                <w:caps/>
+                <w:color w:val="64748B"/>
+                <w:sz w:val="13"/>
               </w:rPr>
-              <w:t>RUT</w:t>
+              <w:t>Tipo de contrato</w:t>
+            </w:r>
+          </w:p>
+          <w:p>
+            <w:pPr>
+              <w:spacing w:before="0" w:after="0" w:line="240" w:lineRule="auto"/>
+            </w:pPr>
+            <w:r>
+              <w:rPr>
+                <w:b w:val="0"/>
+                <w:caps w:val="0"/>
+                <w:color w:val="1E293B"/>
+                <w:sz w:val="18"/>
+              </w:rPr>
             </w:r>
           </w:p>
         </w:tc>
         <w:tc>
           <w:tcPr>
-            <w:tcW w:type="dxa" w:w="3402"/>
-            <w:shd w:val="clear" w:color="auto" w:fill="FFF4D6"/>
+            <w:tcW w:type="dxa" w:w="2606"/>
+            <w:shd w:val="clear" w:color="auto" w:fill="F1F5F4"/>
+            <w:tcBorders>
+              <w:top w:val="nil"/>
+              <w:left w:val="nil"/>
+              <w:bottom w:val="nil"/>
+              <w:right w:val="single" w:sz="4" w:color="D7DEE4"/>
+            </w:tcBorders>
           </w:tcPr>
           <w:p>
             <w:pPr>
-              <w:jc w:val="left"/>
+              <w:spacing w:before="0" w:after="0" w:line="240" w:lineRule="auto"/>
             </w:pPr>
-            <w:r/>
+            <w:r>
+              <w:rPr>
+                <w:b/>
+                <w:caps/>
+                <w:color w:val="64748B"/>
+                <w:sz w:val="13"/>
+              </w:rPr>
+              <w:t>AFP</w:t>
+            </w:r>
+          </w:p>
+          <w:p>
+            <w:pPr>
+              <w:spacing w:before="0" w:after="0" w:line="240" w:lineRule="auto"/>
+            </w:pPr>
+            <w:r>
+              <w:rPr>
+                <w:b w:val="0"/>
+                <w:caps w:val="0"/>
+                <w:color w:val="1E293B"/>
+                <w:sz w:val="18"/>
+              </w:rPr>
+            </w:r>
+          </w:p>
+        </w:tc>
+        <w:tc>
+          <w:tcPr>
+            <w:tcW w:type="dxa" w:w="2606"/>
+            <w:shd w:val="clear" w:color="auto" w:fill="F1F5F4"/>
+            <w:tcBorders>
+              <w:top w:val="nil"/>
+              <w:left w:val="nil"/>
+              <w:bottom w:val="nil"/>
+              <w:right w:val="single" w:sz="4" w:color="D7DEE4"/>
+            </w:tcBorders>
+          </w:tcPr>
+          <w:p>
+            <w:pPr>
+              <w:spacing w:before="0" w:after="0" w:line="240" w:lineRule="auto"/>
+            </w:pPr>
+            <w:r>
+              <w:rPr>
+                <w:b/>
+                <w:caps/>
+                <w:color w:val="64748B"/>
+                <w:sz w:val="13"/>
+              </w:rPr>
+              <w:t>Sistema de salud</w:t>
+            </w:r>
+          </w:p>
+          <w:p>
+            <w:pPr>
+              <w:spacing w:before="0" w:after="0" w:line="240" w:lineRule="auto"/>
+            </w:pPr>
+            <w:r>
+              <w:rPr>
+                <w:b w:val="0"/>
+                <w:caps w:val="0"/>
+                <w:color w:val="1E293B"/>
+                <w:sz w:val="18"/>
+              </w:rPr>
+            </w:r>
+          </w:p>
+        </w:tc>
+        <w:tc>
+          <w:tcPr>
+            <w:tcW w:type="dxa" w:w="2606"/>
+            <w:shd w:val="clear" w:color="auto" w:fill="F1F5F4"/>
+            <w:tcBorders>
+              <w:top w:val="nil"/>
+              <w:left w:val="nil"/>
+              <w:bottom w:val="nil"/>
+              <w:right w:val="nil"/>
+            </w:tcBorders>
+          </w:tcPr>
+          <w:p>
+            <w:pPr>
+              <w:spacing w:before="0" w:after="0" w:line="240" w:lineRule="auto"/>
+            </w:pPr>
+            <w:r>
+              <w:rPr>
+                <w:b/>
+                <w:caps/>
+                <w:color w:val="64748B"/>
+                <w:sz w:val="13"/>
+              </w:rPr>
+              <w:t>Días trabajados</w:t>
+            </w:r>
+          </w:p>
+          <w:p>
+            <w:pPr>
+              <w:spacing w:before="0" w:after="0" w:line="240" w:lineRule="auto"/>
+            </w:pPr>
+            <w:r>
+              <w:rPr>
+                <w:b w:val="0"/>
+                <w:caps w:val="0"/>
+                <w:color w:val="1E293B"/>
+                <w:sz w:val="18"/>
+              </w:rPr>
+            </w:r>
+          </w:p>
+        </w:tc>
+      </w:tr>
+    </w:tbl>
+    <w:p>
+      <w:pPr>
+        <w:spacing w:before="0" w:after="0" w:line="160" w:lineRule="exact"/>
+      </w:pPr>
+      <w:r>
+        <w:rPr>
+          <w:sz w:val="2"/>
+        </w:rPr>
+      </w:r>
+    </w:p>
+    <w:tbl>
+      <w:tblPr>
+        <w:tblW w:type="auto" w:w="0"/>
+        <w:tblLook w:firstColumn="1" w:firstRow="1" w:lastColumn="0" w:lastRow="0" w:noHBand="0" w:noVBand="1" w:val="04A0"/>
+        <w:tblBorders>
+          <w:top w:val="nil"/>
+          <w:left w:val="nil"/>
+          <w:bottom w:val="nil"/>
+          <w:right w:val="nil"/>
+          <w:insideH w:val="nil"/>
+          <w:insideV w:val="nil"/>
+        </w:tblBorders>
+        <w:tblLayout w:type="fixed"/>
+        <w:tblCellMar>
+          <w:top w:w="72" w:type="dxa"/>
+          <w:left w:w="90" w:type="dxa"/>
+          <w:bottom w:w="72" w:type="dxa"/>
+          <w:right w:w="90" w:type="dxa"/>
+        </w:tblCellMar>
+        <w:tblLayout w:type="fixed"/>
+      </w:tblPr>
+      <w:tblGrid>
+        <w:gridCol w:w="3600"/>
+        <w:gridCol w:w="1389"/>
+        <w:gridCol w:w="454"/>
+        <w:gridCol w:w="3600"/>
+        <w:gridCol w:w="1383"/>
+      </w:tblGrid>
+      <w:tr>
+        <w:tc>
+          <w:tcPr>
+            <w:tcW w:type="dxa" w:w="3600"/>
+            <w:shd w:val="clear" w:color="auto" w:fill="E8F0EE"/>
+            <w:tcBorders>
+              <w:top w:val="nil"/>
+              <w:left w:val="nil"/>
+              <w:bottom w:val="single" w:sz="8" w:color="00382E"/>
+              <w:right w:val="nil"/>
+            </w:tcBorders>
+          </w:tcPr>
+          <w:p>
+            <w:pPr>
+              <w:spacing w:before="0" w:after="0" w:line="240" w:lineRule="auto"/>
+            </w:pPr>
+            <w:r>
+              <w:rPr>
+                <w:b/>
+                <w:caps/>
+                <w:color w:val="00382E"/>
+                <w:sz w:val="14"/>
+              </w:rPr>
+              <w:t>Haberes imponibles</w:t>
+            </w:r>
+          </w:p>
+        </w:tc>
+        <w:tc>
+          <w:tcPr>
+            <w:tcW w:type="dxa" w:w="1389"/>
+            <w:shd w:val="clear" w:color="auto" w:fill="E8F0EE"/>
+            <w:tcBorders>
+              <w:top w:val="nil"/>
+              <w:left w:val="nil"/>
+              <w:bottom w:val="single" w:sz="8" w:color="00382E"/>
+              <w:right w:val="nil"/>
+            </w:tcBorders>
+          </w:tcPr>
+          <w:p>
+            <w:pPr>
+              <w:spacing w:before="0" w:after="0" w:line="240" w:lineRule="auto"/>
+              <w:jc w:val="right"/>
+            </w:pPr>
+            <w:r>
+              <w:rPr>
+                <w:b/>
+                <w:caps/>
+                <w:color w:val="00382E"/>
+                <w:sz w:val="14"/>
+              </w:rPr>
+              <w:t>Monto</w:t>
+            </w:r>
+          </w:p>
+        </w:tc>
+        <w:tc>
+          <w:tcPr>
+            <w:tcW w:type="dxa" w:w="454"/>
+          </w:tcPr>
+          <w:p>
+            <w:pPr>
+              <w:spacing w:before="0" w:after="0" w:line="240" w:lineRule="auto"/>
+            </w:pPr>
+            <w:r>
+              <w:rPr>
+                <w:b w:val="0"/>
+                <w:caps w:val="0"/>
+                <w:color w:val="1E293B"/>
+                <w:sz w:val="17"/>
+              </w:rPr>
+            </w:r>
+          </w:p>
+        </w:tc>
+        <w:tc>
+          <w:tcPr>
+            <w:tcW w:type="dxa" w:w="3600"/>
+            <w:shd w:val="clear" w:color="auto" w:fill="E8F0EE"/>
+            <w:tcBorders>
+              <w:top w:val="nil"/>
+              <w:left w:val="nil"/>
+              <w:bottom w:val="single" w:sz="8" w:color="00382E"/>
+              <w:right w:val="nil"/>
+            </w:tcBorders>
+          </w:tcPr>
+          <w:p>
+            <w:pPr>
+              <w:spacing w:before="0" w:after="0" w:line="240" w:lineRule="auto"/>
+            </w:pPr>
+            <w:r>
+              <w:rPr>
+                <w:b/>
+                <w:caps/>
+                <w:color w:val="00382E"/>
+                <w:sz w:val="14"/>
+              </w:rPr>
+              <w:t>Descuentos legales</w:t>
+            </w:r>
+          </w:p>
+        </w:tc>
+        <w:tc>
+          <w:tcPr>
+            <w:tcW w:type="dxa" w:w="1383"/>
+            <w:shd w:val="clear" w:color="auto" w:fill="E8F0EE"/>
+            <w:tcBorders>
+              <w:top w:val="nil"/>
+              <w:left w:val="nil"/>
+              <w:bottom w:val="single" w:sz="8" w:color="00382E"/>
+              <w:right w:val="nil"/>
+            </w:tcBorders>
+          </w:tcPr>
+          <w:p>
+            <w:pPr>
+              <w:spacing w:before="0" w:after="0" w:line="240" w:lineRule="auto"/>
+              <w:jc w:val="right"/>
+            </w:pPr>
+            <w:r>
+              <w:rPr>
+                <w:b/>
+                <w:caps/>
+                <w:color w:val="00382E"/>
+                <w:sz w:val="14"/>
+              </w:rPr>
+              <w:t>Monto</w:t>
+            </w:r>
           </w:p>
         </w:tc>
       </w:tr>
       <w:tr>
         <w:tc>
           <w:tcPr>
-            <w:tcW w:type="dxa" w:w="6236"/>
+            <w:tcW w:type="dxa" w:w="3600"/>
+            <w:tcBorders>
+              <w:top w:val="nil"/>
+              <w:left w:val="nil"/>
+              <w:bottom w:val="single" w:sz="4" w:color="D7DEE4"/>
+              <w:right w:val="nil"/>
+            </w:tcBorders>
           </w:tcPr>
           <w:p>
+            <w:pPr>
+              <w:spacing w:before="0" w:after="0" w:line="240" w:lineRule="auto"/>
+            </w:pPr>
             <w:r>
               <w:rPr>
                 <w:b w:val="0"/>
-              </w:rPr>
-              <w:t>Dirección</w:t>
-            </w:r>
-          </w:p>
-        </w:tc>
-        <w:tc>
-          <w:tcPr>
-            <w:tcW w:type="dxa" w:w="3402"/>
-          </w:tcPr>
-          <w:p>
-            <w:pPr>
-              <w:jc w:val="left"/>
-            </w:pPr>
-            <w:r/>
-          </w:p>
-        </w:tc>
-      </w:tr>
-    </w:tbl>
-    <w:p>
-      <w:pPr>
-        <w:spacing w:before="160" w:after="40"/>
-      </w:pPr>
-      <w:r>
-        <w:rPr>
-          <w:b/>
-          <w:color w:val="00382E"/>
-          <w:sz w:val="19"/>
-        </w:rPr>
-        <w:t>DATOS DEL TRABAJADOR</w:t>
-      </w:r>
-    </w:p>
-    <w:tbl>
-      <w:tblPr>
-        <w:tblStyle w:val="TableGrid"/>
-        <w:tblW w:type="auto" w:w="0"/>
-        <w:jc w:val="center"/>
-        <w:tblLook w:firstColumn="1" w:firstRow="1" w:lastColumn="0" w:lastRow="0" w:noHBand="0" w:noVBand="1" w:val="04A0"/>
-      </w:tblPr>
-      <w:tblGrid>
-        <w:gridCol w:w="4986"/>
-        <w:gridCol w:w="4986"/>
-      </w:tblGrid>
-      <w:tr>
-        <w:tc>
-          <w:tcPr>
-            <w:tcW w:type="dxa" w:w="6236"/>
-          </w:tcPr>
-          <w:p>
-            <w:r>
-              <w:rPr>
-                <w:b w:val="0"/>
-              </w:rPr>
-              <w:t>Nombre completo</w:t>
-            </w:r>
-          </w:p>
-        </w:tc>
-        <w:tc>
-          <w:tcPr>
-            <w:tcW w:type="dxa" w:w="3402"/>
-          </w:tcPr>
-          <w:p>
-            <w:pPr>
-              <w:jc w:val="left"/>
-            </w:pPr>
-            <w:r/>
-          </w:p>
-        </w:tc>
-      </w:tr>
-      <w:tr>
-        <w:tc>
-          <w:tcPr>
-            <w:tcW w:type="dxa" w:w="6236"/>
-            <w:shd w:val="clear" w:color="auto" w:fill="FFF4D6"/>
-          </w:tcPr>
-          <w:p>
-            <w:r>
-              <w:rPr>
-                <w:b/>
-              </w:rPr>
-              <w:t>RUT</w:t>
-            </w:r>
-          </w:p>
-        </w:tc>
-        <w:tc>
-          <w:tcPr>
-            <w:tcW w:type="dxa" w:w="3402"/>
-            <w:shd w:val="clear" w:color="auto" w:fill="FFF4D6"/>
-          </w:tcPr>
-          <w:p>
-            <w:pPr>
-              <w:jc w:val="left"/>
-            </w:pPr>
-            <w:r/>
-          </w:p>
-        </w:tc>
-      </w:tr>
-      <w:tr>
-        <w:tc>
-          <w:tcPr>
-            <w:tcW w:type="dxa" w:w="6236"/>
-          </w:tcPr>
-          <w:p>
-            <w:r>
-              <w:rPr>
-                <w:b w:val="0"/>
-              </w:rPr>
-              <w:t>Cargo</w:t>
-            </w:r>
-          </w:p>
-        </w:tc>
-        <w:tc>
-          <w:tcPr>
-            <w:tcW w:type="dxa" w:w="3402"/>
-          </w:tcPr>
-          <w:p>
-            <w:pPr>
-              <w:jc w:val="left"/>
-            </w:pPr>
-            <w:r/>
-          </w:p>
-        </w:tc>
-      </w:tr>
-      <w:tr>
-        <w:tc>
-          <w:tcPr>
-            <w:tcW w:type="dxa" w:w="6236"/>
-          </w:tcPr>
-          <w:p>
-            <w:r>
-              <w:rPr>
-                <w:b w:val="0"/>
-              </w:rPr>
-              <w:t>Fecha de ingreso</w:t>
-            </w:r>
-          </w:p>
-        </w:tc>
-        <w:tc>
-          <w:tcPr>
-            <w:tcW w:type="dxa" w:w="3402"/>
-          </w:tcPr>
-          <w:p>
-            <w:pPr>
-              <w:jc w:val="left"/>
-            </w:pPr>
-            <w:r/>
-          </w:p>
-        </w:tc>
-      </w:tr>
-      <w:tr>
-        <w:tc>
-          <w:tcPr>
-            <w:tcW w:type="dxa" w:w="6236"/>
-          </w:tcPr>
-          <w:p>
-            <w:r>
-              <w:rPr>
-                <w:b w:val="0"/>
-              </w:rPr>
-              <w:t>Tipo de contrato</w:t>
-            </w:r>
-          </w:p>
-        </w:tc>
-        <w:tc>
-          <w:tcPr>
-            <w:tcW w:type="dxa" w:w="3402"/>
-          </w:tcPr>
-          <w:p>
-            <w:pPr>
-              <w:jc w:val="left"/>
-            </w:pPr>
-            <w:r/>
-          </w:p>
-        </w:tc>
-      </w:tr>
-      <w:tr>
-        <w:tc>
-          <w:tcPr>
-            <w:tcW w:type="dxa" w:w="6236"/>
-            <w:shd w:val="clear" w:color="auto" w:fill="FFF4D6"/>
-          </w:tcPr>
-          <w:p>
-            <w:r>
-              <w:rPr>
-                <w:b/>
-              </w:rPr>
-              <w:t>AFP</w:t>
-            </w:r>
-          </w:p>
-        </w:tc>
-        <w:tc>
-          <w:tcPr>
-            <w:tcW w:type="dxa" w:w="3402"/>
-            <w:shd w:val="clear" w:color="auto" w:fill="FFF4D6"/>
-          </w:tcPr>
-          <w:p>
-            <w:pPr>
-              <w:jc w:val="left"/>
-            </w:pPr>
-            <w:r/>
-          </w:p>
-        </w:tc>
-      </w:tr>
-      <w:tr>
-        <w:tc>
-          <w:tcPr>
-            <w:tcW w:type="dxa" w:w="6236"/>
-          </w:tcPr>
-          <w:p>
-            <w:r>
-              <w:rPr>
-                <w:b w:val="0"/>
-              </w:rPr>
-              <w:t>Sistema de salud (Fonasa o Isapre)</w:t>
-            </w:r>
-          </w:p>
-        </w:tc>
-        <w:tc>
-          <w:tcPr>
-            <w:tcW w:type="dxa" w:w="3402"/>
-          </w:tcPr>
-          <w:p>
-            <w:pPr>
-              <w:jc w:val="left"/>
-            </w:pPr>
-            <w:r/>
-          </w:p>
-        </w:tc>
-      </w:tr>
-      <w:tr>
-        <w:tc>
-          <w:tcPr>
-            <w:tcW w:type="dxa" w:w="6236"/>
-          </w:tcPr>
-          <w:p>
-            <w:r>
-              <w:rPr>
-                <w:b w:val="0"/>
-              </w:rPr>
-              <w:t>Días trabajados</w:t>
-            </w:r>
-          </w:p>
-        </w:tc>
-        <w:tc>
-          <w:tcPr>
-            <w:tcW w:type="dxa" w:w="3402"/>
-          </w:tcPr>
-          <w:p>
-            <w:pPr>
-              <w:jc w:val="left"/>
-            </w:pPr>
-            <w:r/>
-          </w:p>
-        </w:tc>
-      </w:tr>
-    </w:tbl>
-    <w:p>
-      <w:pPr>
-        <w:spacing w:before="160" w:after="40"/>
-      </w:pPr>
-      <w:r>
-        <w:rPr>
-          <w:b/>
-          <w:color w:val="00382E"/>
-          <w:sz w:val="19"/>
-        </w:rPr>
-        <w:t>HABERES IMPONIBLES</w:t>
-      </w:r>
-    </w:p>
-    <w:tbl>
-      <w:tblPr>
-        <w:tblStyle w:val="TableGrid"/>
-        <w:tblW w:type="auto" w:w="0"/>
-        <w:jc w:val="center"/>
-        <w:tblLook w:firstColumn="1" w:firstRow="1" w:lastColumn="0" w:lastRow="0" w:noHBand="0" w:noVBand="1" w:val="04A0"/>
-      </w:tblPr>
-      <w:tblGrid>
-        <w:gridCol w:w="4986"/>
-        <w:gridCol w:w="4986"/>
-      </w:tblGrid>
-      <w:tr>
-        <w:tc>
-          <w:tcPr>
-            <w:tcW w:type="dxa" w:w="6236"/>
-          </w:tcPr>
-          <w:p>
-            <w:r>
-              <w:rPr>
-                <w:b w:val="0"/>
+                <w:caps w:val="0"/>
+                <w:color w:val="1E293B"/>
+                <w:sz w:val="17"/>
               </w:rPr>
               <w:t>Sueldo base</w:t>
             </w:r>
@@ -405,13 +719,95 @@
         </w:tc>
         <w:tc>
           <w:tcPr>
-            <w:tcW w:type="dxa" w:w="3402"/>
+            <w:tcW w:type="dxa" w:w="1389"/>
+            <w:tcBorders>
+              <w:top w:val="nil"/>
+              <w:left w:val="nil"/>
+              <w:bottom w:val="single" w:sz="4" w:color="D7DEE4"/>
+              <w:right w:val="nil"/>
+            </w:tcBorders>
           </w:tcPr>
           <w:p>
             <w:pPr>
+              <w:spacing w:before="0" w:after="0" w:line="240" w:lineRule="auto"/>
               <w:jc w:val="right"/>
             </w:pPr>
             <w:r>
+              <w:rPr>
+                <w:b w:val="0"/>
+                <w:caps w:val="0"/>
+                <w:color w:val="64748B"/>
+                <w:sz w:val="17"/>
+              </w:rPr>
+              <w:t>$</w:t>
+            </w:r>
+          </w:p>
+        </w:tc>
+        <w:tc>
+          <w:tcPr>
+            <w:tcW w:type="dxa" w:w="454"/>
+          </w:tcPr>
+          <w:p>
+            <w:pPr>
+              <w:spacing w:before="0" w:after="0" w:line="240" w:lineRule="auto"/>
+            </w:pPr>
+            <w:r>
+              <w:rPr>
+                <w:b w:val="0"/>
+                <w:caps w:val="0"/>
+                <w:color w:val="1E293B"/>
+                <w:sz w:val="17"/>
+              </w:rPr>
+            </w:r>
+          </w:p>
+        </w:tc>
+        <w:tc>
+          <w:tcPr>
+            <w:tcW w:type="dxa" w:w="3600"/>
+            <w:tcBorders>
+              <w:top w:val="nil"/>
+              <w:left w:val="nil"/>
+              <w:bottom w:val="single" w:sz="4" w:color="D7DEE4"/>
+              <w:right w:val="nil"/>
+            </w:tcBorders>
+          </w:tcPr>
+          <w:p>
+            <w:pPr>
+              <w:spacing w:before="0" w:after="0" w:line="240" w:lineRule="auto"/>
+            </w:pPr>
+            <w:r>
+              <w:rPr>
+                <w:b w:val="0"/>
+                <w:caps w:val="0"/>
+                <w:color w:val="1E293B"/>
+                <w:sz w:val="17"/>
+              </w:rPr>
+              <w:t>AFP (10% + comisión)</w:t>
+            </w:r>
+          </w:p>
+        </w:tc>
+        <w:tc>
+          <w:tcPr>
+            <w:tcW w:type="dxa" w:w="1383"/>
+            <w:tcBorders>
+              <w:top w:val="nil"/>
+              <w:left w:val="nil"/>
+              <w:bottom w:val="single" w:sz="4" w:color="D7DEE4"/>
+              <w:right w:val="nil"/>
+            </w:tcBorders>
+          </w:tcPr>
+          <w:p>
+            <w:pPr>
+              <w:spacing w:before="0" w:after="0" w:line="240" w:lineRule="auto"/>
+              <w:jc w:val="right"/>
+            </w:pPr>
+            <w:r>
+              <w:rPr>
+                <w:b w:val="0"/>
+                <w:caps w:val="0"/>
+                <w:color w:val="64748B"/>
+                <w:sz w:val="17"/>
+              </w:rPr>
               <w:t>$</w:t>
             </w:r>
           </w:p>
@@ -420,12 +816,24 @@
       <w:tr>
         <w:tc>
           <w:tcPr>
-            <w:tcW w:type="dxa" w:w="6236"/>
+            <w:tcW w:type="dxa" w:w="3600"/>
+            <w:tcBorders>
+              <w:top w:val="nil"/>
+              <w:left w:val="nil"/>
+              <w:bottom w:val="single" w:sz="4" w:color="D7DEE4"/>
+              <w:right w:val="nil"/>
+            </w:tcBorders>
           </w:tcPr>
           <w:p>
+            <w:pPr>
+              <w:spacing w:before="0" w:after="0" w:line="240" w:lineRule="auto"/>
+            </w:pPr>
             <w:r>
               <w:rPr>
                 <w:b w:val="0"/>
+                <w:caps w:val="0"/>
+                <w:color w:val="1E293B"/>
+                <w:sz w:val="17"/>
               </w:rPr>
               <w:t>Gratificación</w:t>
             </w:r>
@@ -433,13 +841,95 @@
         </w:tc>
         <w:tc>
           <w:tcPr>
-            <w:tcW w:type="dxa" w:w="3402"/>
+            <w:tcW w:type="dxa" w:w="1389"/>
+            <w:tcBorders>
+              <w:top w:val="nil"/>
+              <w:left w:val="nil"/>
+              <w:bottom w:val="single" w:sz="4" w:color="D7DEE4"/>
+              <w:right w:val="nil"/>
+            </w:tcBorders>
           </w:tcPr>
           <w:p>
             <w:pPr>
+              <w:spacing w:before="0" w:after="0" w:line="240" w:lineRule="auto"/>
               <w:jc w:val="right"/>
             </w:pPr>
             <w:r>
+              <w:rPr>
+                <w:b w:val="0"/>
+                <w:caps w:val="0"/>
+                <w:color w:val="64748B"/>
+                <w:sz w:val="17"/>
+              </w:rPr>
+              <w:t>$</w:t>
+            </w:r>
+          </w:p>
+        </w:tc>
+        <w:tc>
+          <w:tcPr>
+            <w:tcW w:type="dxa" w:w="454"/>
+          </w:tcPr>
+          <w:p>
+            <w:pPr>
+              <w:spacing w:before="0" w:after="0" w:line="240" w:lineRule="auto"/>
+            </w:pPr>
+            <w:r>
+              <w:rPr>
+                <w:b w:val="0"/>
+                <w:caps w:val="0"/>
+                <w:color w:val="1E293B"/>
+                <w:sz w:val="17"/>
+              </w:rPr>
+            </w:r>
+          </w:p>
+        </w:tc>
+        <w:tc>
+          <w:tcPr>
+            <w:tcW w:type="dxa" w:w="3600"/>
+            <w:tcBorders>
+              <w:top w:val="nil"/>
+              <w:left w:val="nil"/>
+              <w:bottom w:val="single" w:sz="4" w:color="D7DEE4"/>
+              <w:right w:val="nil"/>
+            </w:tcBorders>
+          </w:tcPr>
+          <w:p>
+            <w:pPr>
+              <w:spacing w:before="0" w:after="0" w:line="240" w:lineRule="auto"/>
+            </w:pPr>
+            <w:r>
+              <w:rPr>
+                <w:b w:val="0"/>
+                <w:caps w:val="0"/>
+                <w:color w:val="1E293B"/>
+                <w:sz w:val="17"/>
+              </w:rPr>
+              <w:t>Salud (7% o plan Isapre)</w:t>
+            </w:r>
+          </w:p>
+        </w:tc>
+        <w:tc>
+          <w:tcPr>
+            <w:tcW w:type="dxa" w:w="1383"/>
+            <w:tcBorders>
+              <w:top w:val="nil"/>
+              <w:left w:val="nil"/>
+              <w:bottom w:val="single" w:sz="4" w:color="D7DEE4"/>
+              <w:right w:val="nil"/>
+            </w:tcBorders>
+          </w:tcPr>
+          <w:p>
+            <w:pPr>
+              <w:spacing w:before="0" w:after="0" w:line="240" w:lineRule="auto"/>
+              <w:jc w:val="right"/>
+            </w:pPr>
+            <w:r>
+              <w:rPr>
+                <w:b w:val="0"/>
+                <w:caps w:val="0"/>
+                <w:color w:val="64748B"/>
+                <w:sz w:val="17"/>
+              </w:rPr>
               <w:t>$</w:t>
             </w:r>
           </w:p>
@@ -448,12 +938,24 @@
       <w:tr>
         <w:tc>
           <w:tcPr>
-            <w:tcW w:type="dxa" w:w="6236"/>
+            <w:tcW w:type="dxa" w:w="3600"/>
+            <w:tcBorders>
+              <w:top w:val="nil"/>
+              <w:left w:val="nil"/>
+              <w:bottom w:val="single" w:sz="4" w:color="D7DEE4"/>
+              <w:right w:val="nil"/>
+            </w:tcBorders>
           </w:tcPr>
           <w:p>
+            <w:pPr>
+              <w:spacing w:before="0" w:after="0" w:line="240" w:lineRule="auto"/>
+            </w:pPr>
             <w:r>
               <w:rPr>
                 <w:b w:val="0"/>
+                <w:caps w:val="0"/>
+                <w:color w:val="1E293B"/>
+                <w:sz w:val="17"/>
               </w:rPr>
               <w:t>Horas extra</w:t>
             </w:r>
@@ -461,13 +963,95 @@
         </w:tc>
         <w:tc>
           <w:tcPr>
-            <w:tcW w:type="dxa" w:w="3402"/>
+            <w:tcW w:type="dxa" w:w="1389"/>
+            <w:tcBorders>
+              <w:top w:val="nil"/>
+              <w:left w:val="nil"/>
+              <w:bottom w:val="single" w:sz="4" w:color="D7DEE4"/>
+              <w:right w:val="nil"/>
+            </w:tcBorders>
           </w:tcPr>
           <w:p>
             <w:pPr>
+              <w:spacing w:before="0" w:after="0" w:line="240" w:lineRule="auto"/>
               <w:jc w:val="right"/>
             </w:pPr>
             <w:r>
+              <w:rPr>
+                <w:b w:val="0"/>
+                <w:caps w:val="0"/>
+                <w:color w:val="64748B"/>
+                <w:sz w:val="17"/>
+              </w:rPr>
+              <w:t>$</w:t>
+            </w:r>
+          </w:p>
+        </w:tc>
+        <w:tc>
+          <w:tcPr>
+            <w:tcW w:type="dxa" w:w="454"/>
+          </w:tcPr>
+          <w:p>
+            <w:pPr>
+              <w:spacing w:before="0" w:after="0" w:line="240" w:lineRule="auto"/>
+            </w:pPr>
+            <w:r>
+              <w:rPr>
+                <w:b w:val="0"/>
+                <w:caps w:val="0"/>
+                <w:color w:val="1E293B"/>
+                <w:sz w:val="17"/>
+              </w:rPr>
+            </w:r>
+          </w:p>
+        </w:tc>
+        <w:tc>
+          <w:tcPr>
+            <w:tcW w:type="dxa" w:w="3600"/>
+            <w:tcBorders>
+              <w:top w:val="nil"/>
+              <w:left w:val="nil"/>
+              <w:bottom w:val="single" w:sz="4" w:color="D7DEE4"/>
+              <w:right w:val="nil"/>
+            </w:tcBorders>
+          </w:tcPr>
+          <w:p>
+            <w:pPr>
+              <w:spacing w:before="0" w:after="0" w:line="240" w:lineRule="auto"/>
+            </w:pPr>
+            <w:r>
+              <w:rPr>
+                <w:b w:val="0"/>
+                <w:caps w:val="0"/>
+                <w:color w:val="1E293B"/>
+                <w:sz w:val="17"/>
+              </w:rPr>
+              <w:t>Seguro de cesantía (0,6%)</w:t>
+            </w:r>
+          </w:p>
+        </w:tc>
+        <w:tc>
+          <w:tcPr>
+            <w:tcW w:type="dxa" w:w="1383"/>
+            <w:tcBorders>
+              <w:top w:val="nil"/>
+              <w:left w:val="nil"/>
+              <w:bottom w:val="single" w:sz="4" w:color="D7DEE4"/>
+              <w:right w:val="nil"/>
+            </w:tcBorders>
+          </w:tcPr>
+          <w:p>
+            <w:pPr>
+              <w:spacing w:before="0" w:after="0" w:line="240" w:lineRule="auto"/>
+              <w:jc w:val="right"/>
+            </w:pPr>
+            <w:r>
+              <w:rPr>
+                <w:b w:val="0"/>
+                <w:caps w:val="0"/>
+                <w:color w:val="64748B"/>
+                <w:sz w:val="17"/>
+              </w:rPr>
               <w:t>$</w:t>
             </w:r>
           </w:p>
@@ -476,26 +1060,120 @@
       <w:tr>
         <w:tc>
           <w:tcPr>
-            <w:tcW w:type="dxa" w:w="6236"/>
+            <w:tcW w:type="dxa" w:w="3600"/>
+            <w:tcBorders>
+              <w:top w:val="nil"/>
+              <w:left w:val="nil"/>
+              <w:bottom w:val="single" w:sz="4" w:color="D7DEE4"/>
+              <w:right w:val="nil"/>
+            </w:tcBorders>
           </w:tcPr>
           <w:p>
+            <w:pPr>
+              <w:spacing w:before="0" w:after="0" w:line="240" w:lineRule="auto"/>
+            </w:pPr>
             <w:r>
               <w:rPr>
                 <w:b w:val="0"/>
+                <w:caps w:val="0"/>
+                <w:color w:val="1E293B"/>
+                <w:sz w:val="17"/>
               </w:rPr>
-              <w:t>Comisiones y bonos</w:t>
+              <w:t>Comisiones</w:t>
             </w:r>
           </w:p>
         </w:tc>
         <w:tc>
           <w:tcPr>
-            <w:tcW w:type="dxa" w:w="3402"/>
+            <w:tcW w:type="dxa" w:w="1389"/>
+            <w:tcBorders>
+              <w:top w:val="nil"/>
+              <w:left w:val="nil"/>
+              <w:bottom w:val="single" w:sz="4" w:color="D7DEE4"/>
+              <w:right w:val="nil"/>
+            </w:tcBorders>
           </w:tcPr>
           <w:p>
             <w:pPr>
+              <w:spacing w:before="0" w:after="0" w:line="240" w:lineRule="auto"/>
               <w:jc w:val="right"/>
             </w:pPr>
             <w:r>
+              <w:rPr>
+                <w:b w:val="0"/>
+                <w:caps w:val="0"/>
+                <w:color w:val="64748B"/>
+                <w:sz w:val="17"/>
+              </w:rPr>
+              <w:t>$</w:t>
+            </w:r>
+          </w:p>
+        </w:tc>
+        <w:tc>
+          <w:tcPr>
+            <w:tcW w:type="dxa" w:w="454"/>
+          </w:tcPr>
+          <w:p>
+            <w:pPr>
+              <w:spacing w:before="0" w:after="0" w:line="240" w:lineRule="auto"/>
+            </w:pPr>
+            <w:r>
+              <w:rPr>
+                <w:b w:val="0"/>
+                <w:caps w:val="0"/>
+                <w:color w:val="1E293B"/>
+                <w:sz w:val="17"/>
+              </w:rPr>
+            </w:r>
+          </w:p>
+        </w:tc>
+        <w:tc>
+          <w:tcPr>
+            <w:tcW w:type="dxa" w:w="3600"/>
+            <w:tcBorders>
+              <w:top w:val="nil"/>
+              <w:left w:val="nil"/>
+              <w:bottom w:val="single" w:sz="4" w:color="D7DEE4"/>
+              <w:right w:val="nil"/>
+            </w:tcBorders>
+          </w:tcPr>
+          <w:p>
+            <w:pPr>
+              <w:spacing w:before="0" w:after="0" w:line="240" w:lineRule="auto"/>
+            </w:pPr>
+            <w:r>
+              <w:rPr>
+                <w:b w:val="0"/>
+                <w:caps w:val="0"/>
+                <w:color w:val="1E293B"/>
+                <w:sz w:val="17"/>
+              </w:rPr>
+              <w:t>Impuesto único</w:t>
+            </w:r>
+          </w:p>
+        </w:tc>
+        <w:tc>
+          <w:tcPr>
+            <w:tcW w:type="dxa" w:w="1383"/>
+            <w:tcBorders>
+              <w:top w:val="nil"/>
+              <w:left w:val="nil"/>
+              <w:bottom w:val="single" w:sz="4" w:color="D7DEE4"/>
+              <w:right w:val="nil"/>
+            </w:tcBorders>
+          </w:tcPr>
+          <w:p>
+            <w:pPr>
+              <w:spacing w:before="0" w:after="0" w:line="240" w:lineRule="auto"/>
+              <w:jc w:val="right"/>
+            </w:pPr>
+            <w:r>
+              <w:rPr>
+                <w:b w:val="0"/>
+                <w:caps w:val="0"/>
+                <w:color w:val="64748B"/>
+                <w:sz w:val="17"/>
+              </w:rPr>
               <w:t>$</w:t>
             </w:r>
           </w:p>
@@ -504,28 +1182,1200 @@
       <w:tr>
         <w:tc>
           <w:tcPr>
-            <w:tcW w:type="dxa" w:w="6236"/>
-            <w:shd w:val="clear" w:color="auto" w:fill="FFF4D6"/>
+            <w:tcW w:type="dxa" w:w="3600"/>
+            <w:tcBorders>
+              <w:top w:val="nil"/>
+              <w:left w:val="nil"/>
+              <w:bottom w:val="single" w:sz="4" w:color="D7DEE4"/>
+              <w:right w:val="nil"/>
+            </w:tcBorders>
           </w:tcPr>
           <w:p>
+            <w:pPr>
+              <w:spacing w:before="0" w:after="0" w:line="240" w:lineRule="auto"/>
+            </w:pPr>
             <w:r>
               <w:rPr>
-                <w:b/>
+                <w:b w:val="0"/>
+                <w:caps w:val="0"/>
+                <w:color w:val="1E293B"/>
+                <w:sz w:val="17"/>
               </w:rPr>
-              <w:t>TOTAL IMPONIBLE</w:t>
+              <w:t>Bonos</w:t>
             </w:r>
           </w:p>
         </w:tc>
         <w:tc>
           <w:tcPr>
-            <w:tcW w:type="dxa" w:w="3402"/>
-            <w:shd w:val="clear" w:color="auto" w:fill="FFF4D6"/>
+            <w:tcW w:type="dxa" w:w="1389"/>
+            <w:tcBorders>
+              <w:top w:val="nil"/>
+              <w:left w:val="nil"/>
+              <w:bottom w:val="single" w:sz="4" w:color="D7DEE4"/>
+              <w:right w:val="nil"/>
+            </w:tcBorders>
           </w:tcPr>
           <w:p>
             <w:pPr>
+              <w:spacing w:before="0" w:after="0" w:line="240" w:lineRule="auto"/>
               <w:jc w:val="right"/>
             </w:pPr>
             <w:r>
+              <w:rPr>
+                <w:b w:val="0"/>
+                <w:caps w:val="0"/>
+                <w:color w:val="64748B"/>
+                <w:sz w:val="17"/>
+              </w:rPr>
+              <w:t>$</w:t>
+            </w:r>
+          </w:p>
+        </w:tc>
+        <w:tc>
+          <w:tcPr>
+            <w:tcW w:type="dxa" w:w="454"/>
+          </w:tcPr>
+          <w:p>
+            <w:pPr>
+              <w:spacing w:before="0" w:after="0" w:line="240" w:lineRule="auto"/>
+            </w:pPr>
+            <w:r>
+              <w:rPr>
+                <w:b w:val="0"/>
+                <w:caps w:val="0"/>
+                <w:color w:val="1E293B"/>
+                <w:sz w:val="17"/>
+              </w:rPr>
+            </w:r>
+          </w:p>
+        </w:tc>
+        <w:tc>
+          <w:tcPr>
+            <w:tcW w:type="dxa" w:w="3600"/>
+            <w:shd w:val="clear" w:color="auto" w:fill="F1F5F4"/>
+            <w:tcBorders>
+              <w:top w:val="nil"/>
+              <w:left w:val="nil"/>
+              <w:bottom w:val="single" w:sz="4" w:color="D7DEE4"/>
+              <w:right w:val="nil"/>
+            </w:tcBorders>
+          </w:tcPr>
+          <w:p>
+            <w:pPr>
+              <w:spacing w:before="0" w:after="0" w:line="240" w:lineRule="auto"/>
+            </w:pPr>
+            <w:r>
+              <w:rPr>
+                <w:b/>
+                <w:caps w:val="0"/>
+                <w:color w:val="1E293B"/>
+                <w:sz w:val="17"/>
+              </w:rPr>
+              <w:t>Total descuentos legales</w:t>
+            </w:r>
+          </w:p>
+        </w:tc>
+        <w:tc>
+          <w:tcPr>
+            <w:tcW w:type="dxa" w:w="1383"/>
+            <w:shd w:val="clear" w:color="auto" w:fill="F1F5F4"/>
+            <w:tcBorders>
+              <w:top w:val="nil"/>
+              <w:left w:val="nil"/>
+              <w:bottom w:val="single" w:sz="4" w:color="D7DEE4"/>
+              <w:right w:val="nil"/>
+            </w:tcBorders>
+          </w:tcPr>
+          <w:p>
+            <w:pPr>
+              <w:spacing w:before="0" w:after="0" w:line="240" w:lineRule="auto"/>
+              <w:jc w:val="right"/>
+            </w:pPr>
+            <w:r>
+              <w:rPr>
+                <w:b/>
+                <w:caps w:val="0"/>
+                <w:color w:val="1E293B"/>
+                <w:sz w:val="17"/>
+              </w:rPr>
+              <w:t>$</w:t>
+            </w:r>
+          </w:p>
+        </w:tc>
+      </w:tr>
+      <w:tr>
+        <w:tc>
+          <w:tcPr>
+            <w:tcW w:type="dxa" w:w="3600"/>
+            <w:tcBorders>
+              <w:top w:val="nil"/>
+              <w:left w:val="nil"/>
+              <w:bottom w:val="single" w:sz="4" w:color="D7DEE4"/>
+              <w:right w:val="nil"/>
+            </w:tcBorders>
+          </w:tcPr>
+          <w:p>
+            <w:pPr>
+              <w:spacing w:before="0" w:after="0" w:line="240" w:lineRule="auto"/>
+            </w:pPr>
+            <w:r>
+              <w:rPr>
+                <w:b w:val="0"/>
+                <w:caps w:val="0"/>
+                <w:color w:val="1E293B"/>
+                <w:sz w:val="17"/>
+              </w:rPr>
+              <w:t>Semana corrida</w:t>
+            </w:r>
+          </w:p>
+        </w:tc>
+        <w:tc>
+          <w:tcPr>
+            <w:tcW w:type="dxa" w:w="1389"/>
+            <w:tcBorders>
+              <w:top w:val="nil"/>
+              <w:left w:val="nil"/>
+              <w:bottom w:val="single" w:sz="4" w:color="D7DEE4"/>
+              <w:right w:val="nil"/>
+            </w:tcBorders>
+          </w:tcPr>
+          <w:p>
+            <w:pPr>
+              <w:spacing w:before="0" w:after="0" w:line="240" w:lineRule="auto"/>
+              <w:jc w:val="right"/>
+            </w:pPr>
+            <w:r>
+              <w:rPr>
+                <w:b w:val="0"/>
+                <w:caps w:val="0"/>
+                <w:color w:val="64748B"/>
+                <w:sz w:val="17"/>
+              </w:rPr>
+              <w:t>$</w:t>
+            </w:r>
+          </w:p>
+        </w:tc>
+        <w:tc>
+          <w:tcPr>
+            <w:tcW w:type="dxa" w:w="454"/>
+          </w:tcPr>
+          <w:p>
+            <w:pPr>
+              <w:spacing w:before="0" w:after="0" w:line="240" w:lineRule="auto"/>
+            </w:pPr>
+            <w:r>
+              <w:rPr>
+                <w:b w:val="0"/>
+                <w:caps w:val="0"/>
+                <w:color w:val="1E293B"/>
+                <w:sz w:val="17"/>
+              </w:rPr>
+            </w:r>
+          </w:p>
+        </w:tc>
+        <w:tc>
+          <w:tcPr>
+            <w:tcW w:type="dxa" w:w="3600"/>
+            <w:shd w:val="clear" w:color="auto" w:fill="E8F0EE"/>
+            <w:tcBorders>
+              <w:top w:val="nil"/>
+              <w:left w:val="nil"/>
+              <w:bottom w:val="single" w:sz="8" w:color="00382E"/>
+              <w:right w:val="nil"/>
+            </w:tcBorders>
+          </w:tcPr>
+          <w:p>
+            <w:pPr>
+              <w:spacing w:before="0" w:after="0" w:line="240" w:lineRule="auto"/>
+            </w:pPr>
+            <w:r>
+              <w:rPr>
+                <w:b/>
+                <w:caps/>
+                <w:color w:val="00382E"/>
+                <w:sz w:val="14"/>
+              </w:rPr>
+              <w:t>Otros descuentos</w:t>
+            </w:r>
+          </w:p>
+        </w:tc>
+        <w:tc>
+          <w:tcPr>
+            <w:tcW w:type="dxa" w:w="1383"/>
+            <w:shd w:val="clear" w:color="auto" w:fill="E8F0EE"/>
+            <w:tcBorders>
+              <w:top w:val="nil"/>
+              <w:left w:val="nil"/>
+              <w:bottom w:val="single" w:sz="8" w:color="00382E"/>
+              <w:right w:val="nil"/>
+            </w:tcBorders>
+          </w:tcPr>
+          <w:p>
+            <w:pPr>
+              <w:spacing w:before="0" w:after="0" w:line="240" w:lineRule="auto"/>
+              <w:jc w:val="right"/>
+            </w:pPr>
+            <w:r>
+              <w:rPr>
+                <w:b/>
+                <w:caps/>
+                <w:color w:val="00382E"/>
+                <w:sz w:val="14"/>
+              </w:rPr>
+              <w:t>Monto</w:t>
+            </w:r>
+          </w:p>
+        </w:tc>
+      </w:tr>
+      <w:tr>
+        <w:tc>
+          <w:tcPr>
+            <w:tcW w:type="dxa" w:w="3600"/>
+            <w:shd w:val="clear" w:color="auto" w:fill="F1F5F4"/>
+            <w:tcBorders>
+              <w:top w:val="nil"/>
+              <w:left w:val="nil"/>
+              <w:bottom w:val="single" w:sz="4" w:color="D7DEE4"/>
+              <w:right w:val="nil"/>
+            </w:tcBorders>
+          </w:tcPr>
+          <w:p>
+            <w:pPr>
+              <w:spacing w:before="0" w:after="0" w:line="240" w:lineRule="auto"/>
+            </w:pPr>
+            <w:r>
+              <w:rPr>
+                <w:b/>
+                <w:caps w:val="0"/>
+                <w:color w:val="1E293B"/>
+                <w:sz w:val="17"/>
+              </w:rPr>
+              <w:t>Total imponible</w:t>
+            </w:r>
+          </w:p>
+        </w:tc>
+        <w:tc>
+          <w:tcPr>
+            <w:tcW w:type="dxa" w:w="1389"/>
+            <w:shd w:val="clear" w:color="auto" w:fill="F1F5F4"/>
+            <w:tcBorders>
+              <w:top w:val="nil"/>
+              <w:left w:val="nil"/>
+              <w:bottom w:val="single" w:sz="4" w:color="D7DEE4"/>
+              <w:right w:val="nil"/>
+            </w:tcBorders>
+          </w:tcPr>
+          <w:p>
+            <w:pPr>
+              <w:spacing w:before="0" w:after="0" w:line="240" w:lineRule="auto"/>
+              <w:jc w:val="right"/>
+            </w:pPr>
+            <w:r>
+              <w:rPr>
+                <w:b/>
+                <w:caps w:val="0"/>
+                <w:color w:val="1E293B"/>
+                <w:sz w:val="17"/>
+              </w:rPr>
+              <w:t>$</w:t>
+            </w:r>
+          </w:p>
+        </w:tc>
+        <w:tc>
+          <w:tcPr>
+            <w:tcW w:type="dxa" w:w="454"/>
+          </w:tcPr>
+          <w:p>
+            <w:pPr>
+              <w:spacing w:before="0" w:after="0" w:line="240" w:lineRule="auto"/>
+            </w:pPr>
+            <w:r>
+              <w:rPr>
+                <w:b w:val="0"/>
+                <w:caps w:val="0"/>
+                <w:color w:val="1E293B"/>
+                <w:sz w:val="17"/>
+              </w:rPr>
+            </w:r>
+          </w:p>
+        </w:tc>
+        <w:tc>
+          <w:tcPr>
+            <w:tcW w:type="dxa" w:w="3600"/>
+            <w:tcBorders>
+              <w:top w:val="nil"/>
+              <w:left w:val="nil"/>
+              <w:bottom w:val="single" w:sz="4" w:color="D7DEE4"/>
+              <w:right w:val="nil"/>
+            </w:tcBorders>
+          </w:tcPr>
+          <w:p>
+            <w:pPr>
+              <w:spacing w:before="0" w:after="0" w:line="240" w:lineRule="auto"/>
+            </w:pPr>
+            <w:r>
+              <w:rPr>
+                <w:b w:val="0"/>
+                <w:caps w:val="0"/>
+                <w:color w:val="1E293B"/>
+                <w:sz w:val="17"/>
+              </w:rPr>
+              <w:t>Anticipo de sueldo</w:t>
+            </w:r>
+          </w:p>
+        </w:tc>
+        <w:tc>
+          <w:tcPr>
+            <w:tcW w:type="dxa" w:w="1383"/>
+            <w:tcBorders>
+              <w:top w:val="nil"/>
+              <w:left w:val="nil"/>
+              <w:bottom w:val="single" w:sz="4" w:color="D7DEE4"/>
+              <w:right w:val="nil"/>
+            </w:tcBorders>
+          </w:tcPr>
+          <w:p>
+            <w:pPr>
+              <w:spacing w:before="0" w:after="0" w:line="240" w:lineRule="auto"/>
+              <w:jc w:val="right"/>
+            </w:pPr>
+            <w:r>
+              <w:rPr>
+                <w:b w:val="0"/>
+                <w:caps w:val="0"/>
+                <w:color w:val="64748B"/>
+                <w:sz w:val="17"/>
+              </w:rPr>
+              <w:t>$</w:t>
+            </w:r>
+          </w:p>
+        </w:tc>
+      </w:tr>
+      <w:tr>
+        <w:tc>
+          <w:tcPr>
+            <w:tcW w:type="dxa" w:w="3600"/>
+            <w:shd w:val="clear" w:color="auto" w:fill="E8F0EE"/>
+            <w:tcBorders>
+              <w:top w:val="nil"/>
+              <w:left w:val="nil"/>
+              <w:bottom w:val="single" w:sz="8" w:color="00382E"/>
+              <w:right w:val="nil"/>
+            </w:tcBorders>
+          </w:tcPr>
+          <w:p>
+            <w:pPr>
+              <w:spacing w:before="0" w:after="0" w:line="240" w:lineRule="auto"/>
+            </w:pPr>
+            <w:r>
+              <w:rPr>
+                <w:b/>
+                <w:caps/>
+                <w:color w:val="00382E"/>
+                <w:sz w:val="14"/>
+              </w:rPr>
+              <w:t>Haberes no imponibles</w:t>
+            </w:r>
+          </w:p>
+        </w:tc>
+        <w:tc>
+          <w:tcPr>
+            <w:tcW w:type="dxa" w:w="1389"/>
+            <w:shd w:val="clear" w:color="auto" w:fill="E8F0EE"/>
+            <w:tcBorders>
+              <w:top w:val="nil"/>
+              <w:left w:val="nil"/>
+              <w:bottom w:val="single" w:sz="8" w:color="00382E"/>
+              <w:right w:val="nil"/>
+            </w:tcBorders>
+          </w:tcPr>
+          <w:p>
+            <w:pPr>
+              <w:spacing w:before="0" w:after="0" w:line="240" w:lineRule="auto"/>
+              <w:jc w:val="right"/>
+            </w:pPr>
+            <w:r>
+              <w:rPr>
+                <w:b/>
+                <w:caps/>
+                <w:color w:val="00382E"/>
+                <w:sz w:val="14"/>
+              </w:rPr>
+              <w:t>Monto</w:t>
+            </w:r>
+          </w:p>
+        </w:tc>
+        <w:tc>
+          <w:tcPr>
+            <w:tcW w:type="dxa" w:w="454"/>
+          </w:tcPr>
+          <w:p>
+            <w:pPr>
+              <w:spacing w:before="0" w:after="0" w:line="240" w:lineRule="auto"/>
+            </w:pPr>
+            <w:r>
+              <w:rPr>
+                <w:b w:val="0"/>
+                <w:caps w:val="0"/>
+                <w:color w:val="1E293B"/>
+                <w:sz w:val="17"/>
+              </w:rPr>
+            </w:r>
+          </w:p>
+        </w:tc>
+        <w:tc>
+          <w:tcPr>
+            <w:tcW w:type="dxa" w:w="3600"/>
+            <w:tcBorders>
+              <w:top w:val="nil"/>
+              <w:left w:val="nil"/>
+              <w:bottom w:val="single" w:sz="4" w:color="D7DEE4"/>
+              <w:right w:val="nil"/>
+            </w:tcBorders>
+          </w:tcPr>
+          <w:p>
+            <w:pPr>
+              <w:spacing w:before="0" w:after="0" w:line="240" w:lineRule="auto"/>
+            </w:pPr>
+            <w:r>
+              <w:rPr>
+                <w:b w:val="0"/>
+                <w:caps w:val="0"/>
+                <w:color w:val="1E293B"/>
+                <w:sz w:val="17"/>
+              </w:rPr>
+              <w:t>Cuota sindical</w:t>
+            </w:r>
+          </w:p>
+        </w:tc>
+        <w:tc>
+          <w:tcPr>
+            <w:tcW w:type="dxa" w:w="1383"/>
+            <w:tcBorders>
+              <w:top w:val="nil"/>
+              <w:left w:val="nil"/>
+              <w:bottom w:val="single" w:sz="4" w:color="D7DEE4"/>
+              <w:right w:val="nil"/>
+            </w:tcBorders>
+          </w:tcPr>
+          <w:p>
+            <w:pPr>
+              <w:spacing w:before="0" w:after="0" w:line="240" w:lineRule="auto"/>
+              <w:jc w:val="right"/>
+            </w:pPr>
+            <w:r>
+              <w:rPr>
+                <w:b w:val="0"/>
+                <w:caps w:val="0"/>
+                <w:color w:val="64748B"/>
+                <w:sz w:val="17"/>
+              </w:rPr>
+              <w:t>$</w:t>
+            </w:r>
+          </w:p>
+        </w:tc>
+      </w:tr>
+      <w:tr>
+        <w:tc>
+          <w:tcPr>
+            <w:tcW w:type="dxa" w:w="3600"/>
+            <w:tcBorders>
+              <w:top w:val="nil"/>
+              <w:left w:val="nil"/>
+              <w:bottom w:val="single" w:sz="4" w:color="D7DEE4"/>
+              <w:right w:val="nil"/>
+            </w:tcBorders>
+          </w:tcPr>
+          <w:p>
+            <w:pPr>
+              <w:spacing w:before="0" w:after="0" w:line="240" w:lineRule="auto"/>
+            </w:pPr>
+            <w:r>
+              <w:rPr>
+                <w:b w:val="0"/>
+                <w:caps w:val="0"/>
+                <w:color w:val="1E293B"/>
+                <w:sz w:val="17"/>
+              </w:rPr>
+              <w:t>Colación</w:t>
+            </w:r>
+          </w:p>
+        </w:tc>
+        <w:tc>
+          <w:tcPr>
+            <w:tcW w:type="dxa" w:w="1389"/>
+            <w:tcBorders>
+              <w:top w:val="nil"/>
+              <w:left w:val="nil"/>
+              <w:bottom w:val="single" w:sz="4" w:color="D7DEE4"/>
+              <w:right w:val="nil"/>
+            </w:tcBorders>
+          </w:tcPr>
+          <w:p>
+            <w:pPr>
+              <w:spacing w:before="0" w:after="0" w:line="240" w:lineRule="auto"/>
+              <w:jc w:val="right"/>
+            </w:pPr>
+            <w:r>
+              <w:rPr>
+                <w:b w:val="0"/>
+                <w:caps w:val="0"/>
+                <w:color w:val="64748B"/>
+                <w:sz w:val="17"/>
+              </w:rPr>
+              <w:t>$</w:t>
+            </w:r>
+          </w:p>
+        </w:tc>
+        <w:tc>
+          <w:tcPr>
+            <w:tcW w:type="dxa" w:w="454"/>
+          </w:tcPr>
+          <w:p>
+            <w:pPr>
+              <w:spacing w:before="0" w:after="0" w:line="240" w:lineRule="auto"/>
+            </w:pPr>
+            <w:r>
+              <w:rPr>
+                <w:b w:val="0"/>
+                <w:caps w:val="0"/>
+                <w:color w:val="1E293B"/>
+                <w:sz w:val="17"/>
+              </w:rPr>
+            </w:r>
+          </w:p>
+        </w:tc>
+        <w:tc>
+          <w:tcPr>
+            <w:tcW w:type="dxa" w:w="3600"/>
+            <w:tcBorders>
+              <w:top w:val="nil"/>
+              <w:left w:val="nil"/>
+              <w:bottom w:val="single" w:sz="4" w:color="D7DEE4"/>
+              <w:right w:val="nil"/>
+            </w:tcBorders>
+          </w:tcPr>
+          <w:p>
+            <w:pPr>
+              <w:spacing w:before="0" w:after="0" w:line="240" w:lineRule="auto"/>
+            </w:pPr>
+            <w:r>
+              <w:rPr>
+                <w:b w:val="0"/>
+                <w:caps w:val="0"/>
+                <w:color w:val="1E293B"/>
+                <w:sz w:val="17"/>
+              </w:rPr>
+              <w:t>Préstamo caja de compensación</w:t>
+            </w:r>
+          </w:p>
+        </w:tc>
+        <w:tc>
+          <w:tcPr>
+            <w:tcW w:type="dxa" w:w="1383"/>
+            <w:tcBorders>
+              <w:top w:val="nil"/>
+              <w:left w:val="nil"/>
+              <w:bottom w:val="single" w:sz="4" w:color="D7DEE4"/>
+              <w:right w:val="nil"/>
+            </w:tcBorders>
+          </w:tcPr>
+          <w:p>
+            <w:pPr>
+              <w:spacing w:before="0" w:after="0" w:line="240" w:lineRule="auto"/>
+              <w:jc w:val="right"/>
+            </w:pPr>
+            <w:r>
+              <w:rPr>
+                <w:b w:val="0"/>
+                <w:caps w:val="0"/>
+                <w:color w:val="64748B"/>
+                <w:sz w:val="17"/>
+              </w:rPr>
+              <w:t>$</w:t>
+            </w:r>
+          </w:p>
+        </w:tc>
+      </w:tr>
+      <w:tr>
+        <w:tc>
+          <w:tcPr>
+            <w:tcW w:type="dxa" w:w="3600"/>
+            <w:tcBorders>
+              <w:top w:val="nil"/>
+              <w:left w:val="nil"/>
+              <w:bottom w:val="single" w:sz="4" w:color="D7DEE4"/>
+              <w:right w:val="nil"/>
+            </w:tcBorders>
+          </w:tcPr>
+          <w:p>
+            <w:pPr>
+              <w:spacing w:before="0" w:after="0" w:line="240" w:lineRule="auto"/>
+            </w:pPr>
+            <w:r>
+              <w:rPr>
+                <w:b w:val="0"/>
+                <w:caps w:val="0"/>
+                <w:color w:val="1E293B"/>
+                <w:sz w:val="17"/>
+              </w:rPr>
+              <w:t>Movilización</w:t>
+            </w:r>
+          </w:p>
+        </w:tc>
+        <w:tc>
+          <w:tcPr>
+            <w:tcW w:type="dxa" w:w="1389"/>
+            <w:tcBorders>
+              <w:top w:val="nil"/>
+              <w:left w:val="nil"/>
+              <w:bottom w:val="single" w:sz="4" w:color="D7DEE4"/>
+              <w:right w:val="nil"/>
+            </w:tcBorders>
+          </w:tcPr>
+          <w:p>
+            <w:pPr>
+              <w:spacing w:before="0" w:after="0" w:line="240" w:lineRule="auto"/>
+              <w:jc w:val="right"/>
+            </w:pPr>
+            <w:r>
+              <w:rPr>
+                <w:b w:val="0"/>
+                <w:caps w:val="0"/>
+                <w:color w:val="64748B"/>
+                <w:sz w:val="17"/>
+              </w:rPr>
+              <w:t>$</w:t>
+            </w:r>
+          </w:p>
+        </w:tc>
+        <w:tc>
+          <w:tcPr>
+            <w:tcW w:type="dxa" w:w="454"/>
+          </w:tcPr>
+          <w:p>
+            <w:pPr>
+              <w:spacing w:before="0" w:after="0" w:line="240" w:lineRule="auto"/>
+            </w:pPr>
+            <w:r>
+              <w:rPr>
+                <w:b w:val="0"/>
+                <w:caps w:val="0"/>
+                <w:color w:val="1E293B"/>
+                <w:sz w:val="17"/>
+              </w:rPr>
+            </w:r>
+          </w:p>
+        </w:tc>
+        <w:tc>
+          <w:tcPr>
+            <w:tcW w:type="dxa" w:w="3600"/>
+            <w:tcBorders>
+              <w:top w:val="nil"/>
+              <w:left w:val="nil"/>
+              <w:bottom w:val="single" w:sz="4" w:color="D7DEE4"/>
+              <w:right w:val="nil"/>
+            </w:tcBorders>
+          </w:tcPr>
+          <w:p>
+            <w:pPr>
+              <w:spacing w:before="0" w:after="0" w:line="240" w:lineRule="auto"/>
+            </w:pPr>
+            <w:r>
+              <w:rPr>
+                <w:b w:val="0"/>
+                <w:caps w:val="0"/>
+                <w:color w:val="1E293B"/>
+                <w:sz w:val="17"/>
+              </w:rPr>
+              <w:t>Otros descuentos autorizados</w:t>
+            </w:r>
+          </w:p>
+        </w:tc>
+        <w:tc>
+          <w:tcPr>
+            <w:tcW w:type="dxa" w:w="1383"/>
+            <w:tcBorders>
+              <w:top w:val="nil"/>
+              <w:left w:val="nil"/>
+              <w:bottom w:val="single" w:sz="4" w:color="D7DEE4"/>
+              <w:right w:val="nil"/>
+            </w:tcBorders>
+          </w:tcPr>
+          <w:p>
+            <w:pPr>
+              <w:spacing w:before="0" w:after="0" w:line="240" w:lineRule="auto"/>
+              <w:jc w:val="right"/>
+            </w:pPr>
+            <w:r>
+              <w:rPr>
+                <w:b w:val="0"/>
+                <w:caps w:val="0"/>
+                <w:color w:val="64748B"/>
+                <w:sz w:val="17"/>
+              </w:rPr>
+              <w:t>$</w:t>
+            </w:r>
+          </w:p>
+        </w:tc>
+      </w:tr>
+      <w:tr>
+        <w:tc>
+          <w:tcPr>
+            <w:tcW w:type="dxa" w:w="3600"/>
+            <w:tcBorders>
+              <w:top w:val="nil"/>
+              <w:left w:val="nil"/>
+              <w:bottom w:val="single" w:sz="4" w:color="D7DEE4"/>
+              <w:right w:val="nil"/>
+            </w:tcBorders>
+          </w:tcPr>
+          <w:p>
+            <w:pPr>
+              <w:spacing w:before="0" w:after="0" w:line="240" w:lineRule="auto"/>
+            </w:pPr>
+            <w:r>
+              <w:rPr>
+                <w:b w:val="0"/>
+                <w:caps w:val="0"/>
+                <w:color w:val="1E293B"/>
+                <w:sz w:val="17"/>
+              </w:rPr>
+              <w:t>Viáticos</w:t>
+            </w:r>
+          </w:p>
+        </w:tc>
+        <w:tc>
+          <w:tcPr>
+            <w:tcW w:type="dxa" w:w="1389"/>
+            <w:tcBorders>
+              <w:top w:val="nil"/>
+              <w:left w:val="nil"/>
+              <w:bottom w:val="single" w:sz="4" w:color="D7DEE4"/>
+              <w:right w:val="nil"/>
+            </w:tcBorders>
+          </w:tcPr>
+          <w:p>
+            <w:pPr>
+              <w:spacing w:before="0" w:after="0" w:line="240" w:lineRule="auto"/>
+              <w:jc w:val="right"/>
+            </w:pPr>
+            <w:r>
+              <w:rPr>
+                <w:b w:val="0"/>
+                <w:caps w:val="0"/>
+                <w:color w:val="64748B"/>
+                <w:sz w:val="17"/>
+              </w:rPr>
+              <w:t>$</w:t>
+            </w:r>
+          </w:p>
+        </w:tc>
+        <w:tc>
+          <w:tcPr>
+            <w:tcW w:type="dxa" w:w="454"/>
+          </w:tcPr>
+          <w:p>
+            <w:pPr>
+              <w:spacing w:before="0" w:after="0" w:line="240" w:lineRule="auto"/>
+            </w:pPr>
+            <w:r>
+              <w:rPr>
+                <w:b w:val="0"/>
+                <w:caps w:val="0"/>
+                <w:color w:val="1E293B"/>
+                <w:sz w:val="17"/>
+              </w:rPr>
+            </w:r>
+          </w:p>
+        </w:tc>
+        <w:tc>
+          <w:tcPr>
+            <w:tcW w:type="dxa" w:w="3600"/>
+            <w:shd w:val="clear" w:color="auto" w:fill="F1F5F4"/>
+            <w:tcBorders>
+              <w:top w:val="nil"/>
+              <w:left w:val="nil"/>
+              <w:bottom w:val="single" w:sz="4" w:color="D7DEE4"/>
+              <w:right w:val="nil"/>
+            </w:tcBorders>
+          </w:tcPr>
+          <w:p>
+            <w:pPr>
+              <w:spacing w:before="0" w:after="0" w:line="240" w:lineRule="auto"/>
+            </w:pPr>
+            <w:r>
+              <w:rPr>
+                <w:b/>
+                <w:caps w:val="0"/>
+                <w:color w:val="1E293B"/>
+                <w:sz w:val="17"/>
+              </w:rPr>
+              <w:t>Total otros descuentos</w:t>
+            </w:r>
+          </w:p>
+        </w:tc>
+        <w:tc>
+          <w:tcPr>
+            <w:tcW w:type="dxa" w:w="1383"/>
+            <w:shd w:val="clear" w:color="auto" w:fill="F1F5F4"/>
+            <w:tcBorders>
+              <w:top w:val="nil"/>
+              <w:left w:val="nil"/>
+              <w:bottom w:val="single" w:sz="4" w:color="D7DEE4"/>
+              <w:right w:val="nil"/>
+            </w:tcBorders>
+          </w:tcPr>
+          <w:p>
+            <w:pPr>
+              <w:spacing w:before="0" w:after="0" w:line="240" w:lineRule="auto"/>
+              <w:jc w:val="right"/>
+            </w:pPr>
+            <w:r>
+              <w:rPr>
+                <w:b/>
+                <w:caps w:val="0"/>
+                <w:color w:val="1E293B"/>
+                <w:sz w:val="17"/>
+              </w:rPr>
+              <w:t>$</w:t>
+            </w:r>
+          </w:p>
+        </w:tc>
+      </w:tr>
+      <w:tr>
+        <w:tc>
+          <w:tcPr>
+            <w:tcW w:type="dxa" w:w="3600"/>
+            <w:tcBorders>
+              <w:top w:val="nil"/>
+              <w:left w:val="nil"/>
+              <w:bottom w:val="single" w:sz="4" w:color="D7DEE4"/>
+              <w:right w:val="nil"/>
+            </w:tcBorders>
+          </w:tcPr>
+          <w:p>
+            <w:pPr>
+              <w:spacing w:before="0" w:after="0" w:line="240" w:lineRule="auto"/>
+            </w:pPr>
+            <w:r>
+              <w:rPr>
+                <w:b w:val="0"/>
+                <w:caps w:val="0"/>
+                <w:color w:val="1E293B"/>
+                <w:sz w:val="17"/>
+              </w:rPr>
+              <w:t>Asignación familiar</w:t>
+            </w:r>
+          </w:p>
+        </w:tc>
+        <w:tc>
+          <w:tcPr>
+            <w:tcW w:type="dxa" w:w="1389"/>
+            <w:tcBorders>
+              <w:top w:val="nil"/>
+              <w:left w:val="nil"/>
+              <w:bottom w:val="single" w:sz="4" w:color="D7DEE4"/>
+              <w:right w:val="nil"/>
+            </w:tcBorders>
+          </w:tcPr>
+          <w:p>
+            <w:pPr>
+              <w:spacing w:before="0" w:after="0" w:line="240" w:lineRule="auto"/>
+              <w:jc w:val="right"/>
+            </w:pPr>
+            <w:r>
+              <w:rPr>
+                <w:b w:val="0"/>
+                <w:caps w:val="0"/>
+                <w:color w:val="64748B"/>
+                <w:sz w:val="17"/>
+              </w:rPr>
+              <w:t>$</w:t>
+            </w:r>
+          </w:p>
+        </w:tc>
+        <w:tc>
+          <w:tcPr>
+            <w:tcW w:type="dxa" w:w="454"/>
+          </w:tcPr>
+          <w:p>
+            <w:pPr>
+              <w:spacing w:before="0" w:after="0" w:line="240" w:lineRule="auto"/>
+            </w:pPr>
+            <w:r>
+              <w:rPr>
+                <w:b w:val="0"/>
+                <w:caps w:val="0"/>
+                <w:color w:val="1E293B"/>
+                <w:sz w:val="17"/>
+              </w:rPr>
+            </w:r>
+          </w:p>
+        </w:tc>
+        <w:tc>
+          <w:tcPr>
+            <w:tcW w:type="dxa" w:w="3600"/>
+          </w:tcPr>
+          <w:p>
+            <w:pPr>
+              <w:spacing w:before="0" w:after="0" w:line="240" w:lineRule="auto"/>
+            </w:pPr>
+            <w:r>
+              <w:rPr>
+                <w:b w:val="0"/>
+                <w:caps w:val="0"/>
+                <w:color w:val="1E293B"/>
+                <w:sz w:val="17"/>
+              </w:rPr>
+            </w:r>
+          </w:p>
+        </w:tc>
+        <w:tc>
+          <w:tcPr>
+            <w:tcW w:type="dxa" w:w="1383"/>
+          </w:tcPr>
+          <w:p>
+            <w:pPr>
+              <w:spacing w:before="0" w:after="0" w:line="240" w:lineRule="auto"/>
+            </w:pPr>
+            <w:r>
+              <w:rPr>
+                <w:b w:val="0"/>
+                <w:caps w:val="0"/>
+                <w:color w:val="1E293B"/>
+                <w:sz w:val="17"/>
+              </w:rPr>
+            </w:r>
+          </w:p>
+        </w:tc>
+      </w:tr>
+      <w:tr>
+        <w:tc>
+          <w:tcPr>
+            <w:tcW w:type="dxa" w:w="3600"/>
+            <w:shd w:val="clear" w:color="auto" w:fill="F1F5F4"/>
+            <w:tcBorders>
+              <w:top w:val="nil"/>
+              <w:left w:val="nil"/>
+              <w:bottom w:val="single" w:sz="4" w:color="D7DEE4"/>
+              <w:right w:val="nil"/>
+            </w:tcBorders>
+          </w:tcPr>
+          <w:p>
+            <w:pPr>
+              <w:spacing w:before="0" w:after="0" w:line="240" w:lineRule="auto"/>
+            </w:pPr>
+            <w:r>
+              <w:rPr>
+                <w:b/>
+                <w:caps w:val="0"/>
+                <w:color w:val="1E293B"/>
+                <w:sz w:val="17"/>
+              </w:rPr>
+              <w:t>Total no imponible</w:t>
+            </w:r>
+          </w:p>
+        </w:tc>
+        <w:tc>
+          <w:tcPr>
+            <w:tcW w:type="dxa" w:w="1389"/>
+            <w:shd w:val="clear" w:color="auto" w:fill="F1F5F4"/>
+            <w:tcBorders>
+              <w:top w:val="nil"/>
+              <w:left w:val="nil"/>
+              <w:bottom w:val="single" w:sz="4" w:color="D7DEE4"/>
+              <w:right w:val="nil"/>
+            </w:tcBorders>
+          </w:tcPr>
+          <w:p>
+            <w:pPr>
+              <w:spacing w:before="0" w:after="0" w:line="240" w:lineRule="auto"/>
+              <w:jc w:val="right"/>
+            </w:pPr>
+            <w:r>
+              <w:rPr>
+                <w:b/>
+                <w:caps w:val="0"/>
+                <w:color w:val="1E293B"/>
+                <w:sz w:val="17"/>
+              </w:rPr>
+              <w:t>$</w:t>
+            </w:r>
+          </w:p>
+        </w:tc>
+        <w:tc>
+          <w:tcPr>
+            <w:tcW w:type="dxa" w:w="454"/>
+          </w:tcPr>
+          <w:p>
+            <w:pPr>
+              <w:spacing w:before="0" w:after="0" w:line="240" w:lineRule="auto"/>
+            </w:pPr>
+            <w:r>
+              <w:rPr>
+                <w:b w:val="0"/>
+                <w:caps w:val="0"/>
+                <w:color w:val="1E293B"/>
+                <w:sz w:val="17"/>
+              </w:rPr>
+            </w:r>
+          </w:p>
+        </w:tc>
+        <w:tc>
+          <w:tcPr>
+            <w:tcW w:type="dxa" w:w="3600"/>
+          </w:tcPr>
+          <w:p>
+            <w:pPr>
+              <w:spacing w:before="0" w:after="0" w:line="240" w:lineRule="auto"/>
+            </w:pPr>
+            <w:r>
+              <w:rPr>
+                <w:b w:val="0"/>
+                <w:caps w:val="0"/>
+                <w:color w:val="1E293B"/>
+                <w:sz w:val="17"/>
+              </w:rPr>
+            </w:r>
+          </w:p>
+        </w:tc>
+        <w:tc>
+          <w:tcPr>
+            <w:tcW w:type="dxa" w:w="1383"/>
+          </w:tcPr>
+          <w:p>
+            <w:pPr>
+              <w:spacing w:before="0" w:after="0" w:line="240" w:lineRule="auto"/>
+            </w:pPr>
+            <w:r>
+              <w:rPr>
+                <w:b w:val="0"/>
+                <w:caps w:val="0"/>
+                <w:color w:val="1E293B"/>
+                <w:sz w:val="17"/>
+              </w:rPr>
+            </w:r>
+          </w:p>
+        </w:tc>
+      </w:tr>
+      <w:tr>
+        <w:tc>
+          <w:tcPr>
+            <w:tcW w:type="dxa" w:w="3600"/>
+            <w:tcBorders>
+              <w:top w:val="single" w:sz="12" w:color="00382E"/>
+              <w:left w:val="nil"/>
+              <w:bottom w:val="single" w:sz="12" w:color="00382E"/>
+              <w:right w:val="nil"/>
+            </w:tcBorders>
+          </w:tcPr>
+          <w:p>
+            <w:pPr>
+              <w:spacing w:before="0" w:after="0" w:line="240" w:lineRule="auto"/>
+            </w:pPr>
+            <w:r>
+              <w:rPr>
+                <w:b/>
+                <w:caps w:val="0"/>
+                <w:color w:val="1E293B"/>
+                <w:sz w:val="18"/>
+              </w:rPr>
+              <w:t>TOTAL HABERES</w:t>
+            </w:r>
+          </w:p>
+        </w:tc>
+        <w:tc>
+          <w:tcPr>
+            <w:tcW w:type="dxa" w:w="1389"/>
+            <w:tcBorders>
+              <w:top w:val="single" w:sz="12" w:color="00382E"/>
+              <w:left w:val="nil"/>
+              <w:bottom w:val="single" w:sz="12" w:color="00382E"/>
+              <w:right w:val="nil"/>
+            </w:tcBorders>
+          </w:tcPr>
+          <w:p>
+            <w:pPr>
+              <w:spacing w:before="0" w:after="0" w:line="240" w:lineRule="auto"/>
+              <w:jc w:val="right"/>
+            </w:pPr>
+            <w:r>
+              <w:rPr>
+                <w:b/>
+                <w:caps w:val="0"/>
+                <w:color w:val="1E293B"/>
+                <w:sz w:val="18"/>
+              </w:rPr>
+              <w:t>$</w:t>
+            </w:r>
+          </w:p>
+        </w:tc>
+        <w:tc>
+          <w:tcPr>
+            <w:tcW w:type="dxa" w:w="454"/>
+          </w:tcPr>
+          <w:p>
+            <w:pPr>
+              <w:spacing w:before="0" w:after="0" w:line="240" w:lineRule="auto"/>
+            </w:pPr>
+            <w:r>
+              <w:rPr>
+                <w:b w:val="0"/>
+                <w:caps w:val="0"/>
+                <w:color w:val="1E293B"/>
+                <w:sz w:val="17"/>
+              </w:rPr>
+            </w:r>
+          </w:p>
+        </w:tc>
+        <w:tc>
+          <w:tcPr>
+            <w:tcW w:type="dxa" w:w="3600"/>
+            <w:tcBorders>
+              <w:top w:val="single" w:sz="12" w:color="00382E"/>
+              <w:left w:val="nil"/>
+              <w:bottom w:val="single" w:sz="12" w:color="00382E"/>
+              <w:right w:val="nil"/>
+            </w:tcBorders>
+          </w:tcPr>
+          <w:p>
+            <w:pPr>
+              <w:spacing w:before="0" w:after="0" w:line="240" w:lineRule="auto"/>
+            </w:pPr>
+            <w:r>
+              <w:rPr>
+                <w:b/>
+                <w:caps w:val="0"/>
+                <w:color w:val="1E293B"/>
+                <w:sz w:val="18"/>
+              </w:rPr>
+              <w:t>TOTAL DESCUENTOS</w:t>
+            </w:r>
+          </w:p>
+        </w:tc>
+        <w:tc>
+          <w:tcPr>
+            <w:tcW w:type="dxa" w:w="1383"/>
+            <w:tcBorders>
+              <w:top w:val="single" w:sz="12" w:color="00382E"/>
+              <w:left w:val="nil"/>
+              <w:bottom w:val="single" w:sz="12" w:color="00382E"/>
+              <w:right w:val="nil"/>
+            </w:tcBorders>
+          </w:tcPr>
+          <w:p>
+            <w:pPr>
+              <w:spacing w:before="0" w:after="0" w:line="240" w:lineRule="auto"/>
+              <w:jc w:val="right"/>
+            </w:pPr>
+            <w:r>
+              <w:rPr>
+                <w:b/>
+                <w:caps w:val="0"/>
+                <w:color w:val="1E293B"/>
+                <w:sz w:val="18"/>
+              </w:rPr>
               <w:t>$</w:t>
             </w:r>
           </w:p>
@@ -534,168 +2384,185 @@
     </w:tbl>
     <w:p>
       <w:pPr>
-        <w:spacing w:before="160" w:after="40"/>
+        <w:spacing w:before="0" w:after="0" w:line="200" w:lineRule="exact"/>
       </w:pPr>
       <w:r>
         <w:rPr>
-          <w:b/>
-          <w:color w:val="00382E"/>
-          <w:sz w:val="19"/>
+          <w:sz w:val="2"/>
         </w:rPr>
-        <w:t>HABERES NO IMPONIBLES</w:t>
       </w:r>
     </w:p>
     <w:tbl>
       <w:tblPr>
-        <w:tblStyle w:val="TableGrid"/>
         <w:tblW w:type="auto" w:w="0"/>
-        <w:jc w:val="center"/>
         <w:tblLook w:firstColumn="1" w:firstRow="1" w:lastColumn="0" w:lastRow="0" w:noHBand="0" w:noVBand="1" w:val="04A0"/>
+        <w:tblBorders>
+          <w:top w:val="nil"/>
+          <w:left w:val="nil"/>
+          <w:bottom w:val="nil"/>
+          <w:right w:val="nil"/>
+          <w:insideH w:val="nil"/>
+          <w:insideV w:val="nil"/>
+        </w:tblBorders>
+        <w:tblLayout w:type="fixed"/>
+        <w:tblCellMar>
+          <w:top w:w="80" w:type="dxa"/>
+          <w:left w:w="140" w:type="dxa"/>
+          <w:bottom w:w="80" w:type="dxa"/>
+          <w:right w:w="140" w:type="dxa"/>
+        </w:tblCellMar>
+        <w:tblLayout w:type="fixed"/>
       </w:tblPr>
       <w:tblGrid>
-        <w:gridCol w:w="4986"/>
-        <w:gridCol w:w="4986"/>
+        <w:gridCol w:w="4989"/>
+        <w:gridCol w:w="454"/>
+        <w:gridCol w:w="4983"/>
       </w:tblGrid>
       <w:tr>
         <w:tc>
           <w:tcPr>
-            <w:tcW w:type="dxa" w:w="6236"/>
+            <w:tcW w:type="dxa" w:w="4989"/>
+            <w:tcBorders>
+              <w:top w:val="single" w:sz="4" w:color="D7DEE4"/>
+              <w:left w:val="single" w:sz="4" w:color="D7DEE4"/>
+              <w:bottom w:val="single" w:sz="4" w:color="D7DEE4"/>
+              <w:right w:val="single" w:sz="4" w:color="D7DEE4"/>
+            </w:tcBorders>
           </w:tcPr>
           <w:p>
+            <w:pPr>
+              <w:spacing w:before="0" w:after="0" w:line="240" w:lineRule="auto"/>
+            </w:pPr>
+            <w:r>
+              <w:rPr>
+                <w:b/>
+                <w:caps/>
+                <w:color w:val="64748B"/>
+                <w:sz w:val="13"/>
+              </w:rPr>
+              <w:t>Bases de cálculo</w:t>
+            </w:r>
+          </w:p>
+          <w:p>
+            <w:pPr>
+              <w:spacing w:before="60" w:after="0" w:line="240" w:lineRule="auto"/>
+            </w:pPr>
             <w:r>
               <w:rPr>
                 <w:b w:val="0"/>
+                <w:caps w:val="0"/>
+                <w:color w:val="1E293B"/>
+                <w:sz w:val="16"/>
               </w:rPr>
-              <w:t>Colación</w:t>
+              <w:t>Base imponible AFP y salud:  $</w:t>
+            </w:r>
+          </w:p>
+          <w:p>
+            <w:pPr>
+              <w:spacing w:before="60" w:after="0" w:line="240" w:lineRule="auto"/>
+            </w:pPr>
+            <w:r>
+              <w:rPr>
+                <w:b w:val="0"/>
+                <w:caps w:val="0"/>
+                <w:color w:val="1E293B"/>
+                <w:sz w:val="16"/>
+              </w:rPr>
+              <w:t>Base seguro de cesantía:  $</w:t>
+            </w:r>
+          </w:p>
+          <w:p>
+            <w:pPr>
+              <w:spacing w:before="60" w:after="0" w:line="240" w:lineRule="auto"/>
+            </w:pPr>
+            <w:r>
+              <w:rPr>
+                <w:b w:val="0"/>
+                <w:caps w:val="0"/>
+                <w:color w:val="1E293B"/>
+                <w:sz w:val="16"/>
+              </w:rPr>
+              <w:t>Base tributable (impuesto único):  $</w:t>
+            </w:r>
+          </w:p>
+          <w:p>
+            <w:pPr>
+              <w:spacing w:before="60" w:after="0" w:line="240" w:lineRule="auto"/>
+            </w:pPr>
+            <w:r>
+              <w:rPr>
+                <w:b w:val="0"/>
+                <w:caps w:val="0"/>
+                <w:color w:val="1E293B"/>
+                <w:sz w:val="16"/>
+              </w:rPr>
+              <w:t>Valor UF: $                    Valor UTM: $</w:t>
             </w:r>
           </w:p>
         </w:tc>
         <w:tc>
           <w:tcPr>
-            <w:tcW w:type="dxa" w:w="3402"/>
+            <w:tcW w:type="dxa" w:w="454"/>
           </w:tcPr>
           <w:p>
             <w:pPr>
-              <w:jc w:val="right"/>
+              <w:spacing w:before="0" w:after="0" w:line="240" w:lineRule="auto"/>
             </w:pPr>
-            <w:r>
-              <w:t>$</w:t>
-            </w:r>
-          </w:p>
-        </w:tc>
-      </w:tr>
-      <w:tr>
-        <w:tc>
-          <w:tcPr>
-            <w:tcW w:type="dxa" w:w="6236"/>
-          </w:tcPr>
-          <w:p>
             <w:r>
               <w:rPr>
                 <w:b w:val="0"/>
+                <w:caps w:val="0"/>
+                <w:color w:val="1E293B"/>
+                <w:sz w:val="17"/>
               </w:rPr>
-              <w:t>Movilización</w:t>
             </w:r>
           </w:p>
         </w:tc>
         <w:tc>
           <w:tcPr>
-            <w:tcW w:type="dxa" w:w="3402"/>
+            <w:tcW w:type="dxa" w:w="4983"/>
+            <w:shd w:val="clear" w:color="auto" w:fill="00382E"/>
           </w:tcPr>
           <w:p>
             <w:pPr>
-              <w:jc w:val="right"/>
+              <w:spacing w:before="0" w:after="0" w:line="240" w:lineRule="auto"/>
             </w:pPr>
             <w:r>
+              <w:rPr>
+                <w:b/>
+                <w:caps/>
+                <w:color w:val="FFB703"/>
+                <w:sz w:val="14"/>
+              </w:rPr>
+              <w:t>Líquido a pagar</w:t>
+            </w:r>
+          </w:p>
+          <w:p>
+            <w:pPr>
+              <w:spacing w:before="80" w:after="0" w:line="240" w:lineRule="auto"/>
+            </w:pPr>
+            <w:r>
+              <w:rPr>
+                <w:b/>
+                <w:caps w:val="0"/>
+                <w:color w:val="FFFFFF"/>
+                <w:sz w:val="36"/>
+              </w:rPr>
               <w:t>$</w:t>
             </w:r>
           </w:p>
-        </w:tc>
-      </w:tr>
-      <w:tr>
-        <w:tc>
-          <w:tcPr>
-            <w:tcW w:type="dxa" w:w="6236"/>
-          </w:tcPr>
           <w:p>
+            <w:pPr>
+              <w:spacing w:before="120" w:after="0" w:line="240" w:lineRule="auto"/>
+            </w:pPr>
             <w:r>
               <w:rPr>
                 <w:b w:val="0"/>
+                <w:caps w:val="0"/>
+                <w:color w:val="D9E6E3"/>
+                <w:sz w:val="15"/>
               </w:rPr>
-              <w:t>Viáticos</w:t>
-            </w:r>
-          </w:p>
-        </w:tc>
-        <w:tc>
-          <w:tcPr>
-            <w:tcW w:type="dxa" w:w="3402"/>
-          </w:tcPr>
-          <w:p>
-            <w:pPr>
-              <w:jc w:val="right"/>
-            </w:pPr>
-            <w:r>
-              <w:t>$</w:t>
-            </w:r>
-          </w:p>
-        </w:tc>
-      </w:tr>
-      <w:tr>
-        <w:tc>
-          <w:tcPr>
-            <w:tcW w:type="dxa" w:w="6236"/>
-            <w:shd w:val="clear" w:color="auto" w:fill="FFF4D6"/>
-          </w:tcPr>
-          <w:p>
-            <w:r>
-              <w:rPr>
-                <w:b/>
-              </w:rPr>
-              <w:t>TOTAL NO IMPONIBLE</w:t>
-            </w:r>
-          </w:p>
-        </w:tc>
-        <w:tc>
-          <w:tcPr>
-            <w:tcW w:type="dxa" w:w="3402"/>
-            <w:shd w:val="clear" w:color="auto" w:fill="FFF4D6"/>
-          </w:tcPr>
-          <w:p>
-            <w:pPr>
-              <w:jc w:val="right"/>
-            </w:pPr>
-            <w:r>
-              <w:t>$</w:t>
-            </w:r>
-          </w:p>
-        </w:tc>
-      </w:tr>
-      <w:tr>
-        <w:tc>
-          <w:tcPr>
-            <w:tcW w:type="dxa" w:w="6236"/>
-            <w:shd w:val="clear" w:color="auto" w:fill="FFF4D6"/>
-          </w:tcPr>
-          <w:p>
-            <w:r>
-              <w:rPr>
-                <w:b/>
-              </w:rPr>
-              <w:t>TOTAL HABERES</w:t>
-            </w:r>
-          </w:p>
-        </w:tc>
-        <w:tc>
-          <w:tcPr>
-            <w:tcW w:type="dxa" w:w="3402"/>
-            <w:shd w:val="clear" w:color="auto" w:fill="FFF4D6"/>
-          </w:tcPr>
-          <w:p>
-            <w:pPr>
-              <w:jc w:val="right"/>
-            </w:pPr>
-            <w:r>
-              <w:t>$</w:t>
+              <w:t>Son: _______________________________ pesos</w:t>
             </w:r>
           </w:p>
         </w:tc>
@@ -703,222 +2570,155 @@
     </w:tbl>
     <w:p>
       <w:pPr>
-        <w:spacing w:before="160" w:after="40"/>
+        <w:spacing w:before="0" w:after="0" w:line="160" w:lineRule="exact"/>
       </w:pPr>
       <w:r>
         <w:rPr>
-          <w:b/>
-          <w:color w:val="00382E"/>
-          <w:sz w:val="19"/>
+          <w:sz w:val="2"/>
         </w:rPr>
-        <w:t>DESCUENTOS</w:t>
       </w:r>
     </w:p>
     <w:tbl>
       <w:tblPr>
-        <w:tblStyle w:val="TableGrid"/>
         <w:tblW w:type="auto" w:w="0"/>
-        <w:jc w:val="center"/>
         <w:tblLook w:firstColumn="1" w:firstRow="1" w:lastColumn="0" w:lastRow="0" w:noHBand="0" w:noVBand="1" w:val="04A0"/>
+        <w:tblBorders>
+          <w:top w:val="nil"/>
+          <w:left w:val="nil"/>
+          <w:bottom w:val="nil"/>
+          <w:right w:val="nil"/>
+          <w:insideH w:val="nil"/>
+          <w:insideV w:val="nil"/>
+        </w:tblBorders>
+        <w:tblLayout w:type="fixed"/>
+        <w:tblCellMar>
+          <w:top w:w="50" w:type="dxa"/>
+          <w:left w:w="0" w:type="dxa"/>
+          <w:bottom w:w="50" w:type="dxa"/>
+          <w:right w:w="90" w:type="dxa"/>
+        </w:tblCellMar>
+        <w:tblLayout w:type="fixed"/>
       </w:tblPr>
       <w:tblGrid>
-        <w:gridCol w:w="4986"/>
-        <w:gridCol w:w="4986"/>
+        <w:gridCol w:w="3475"/>
+        <w:gridCol w:w="3475"/>
+        <w:gridCol w:w="3475"/>
       </w:tblGrid>
       <w:tr>
         <w:tc>
           <w:tcPr>
-            <w:tcW w:type="dxa" w:w="6236"/>
+            <w:tcW w:type="dxa" w:w="3475"/>
+            <w:tcBorders>
+              <w:top w:val="nil"/>
+              <w:left w:val="nil"/>
+              <w:bottom w:val="single" w:sz="4" w:color="D7DEE4"/>
+              <w:right w:val="nil"/>
+            </w:tcBorders>
           </w:tcPr>
           <w:p>
+            <w:pPr>
+              <w:spacing w:before="0" w:after="0" w:line="240" w:lineRule="auto"/>
+            </w:pPr>
+            <w:r>
+              <w:rPr>
+                <w:b/>
+                <w:caps/>
+                <w:color w:val="64748B"/>
+                <w:sz w:val="13"/>
+              </w:rPr>
+              <w:t>Forma de pago</w:t>
+            </w:r>
+          </w:p>
+          <w:p>
+            <w:pPr>
+              <w:spacing w:before="0" w:after="0" w:line="240" w:lineRule="auto"/>
+            </w:pPr>
             <w:r>
               <w:rPr>
                 <w:b w:val="0"/>
+                <w:caps w:val="0"/>
+                <w:color w:val="1E293B"/>
+                <w:sz w:val="17"/>
               </w:rPr>
-              <w:t>AFP (10% + comisión)</w:t>
+              <w:t>Transferencia  /  Efectivo  /  Cheque</w:t>
             </w:r>
           </w:p>
         </w:tc>
         <w:tc>
           <w:tcPr>
-            <w:tcW w:type="dxa" w:w="3402"/>
+            <w:tcW w:type="dxa" w:w="3475"/>
+            <w:tcBorders>
+              <w:top w:val="nil"/>
+              <w:left w:val="nil"/>
+              <w:bottom w:val="single" w:sz="4" w:color="D7DEE4"/>
+              <w:right w:val="nil"/>
+            </w:tcBorders>
           </w:tcPr>
           <w:p>
             <w:pPr>
-              <w:jc w:val="right"/>
+              <w:spacing w:before="0" w:after="0" w:line="240" w:lineRule="auto"/>
             </w:pPr>
             <w:r>
-              <w:t>$</w:t>
+              <w:rPr>
+                <w:b/>
+                <w:caps/>
+                <w:color w:val="64748B"/>
+                <w:sz w:val="13"/>
+              </w:rPr>
+              <w:t>Banco y cuenta</w:t>
             </w:r>
           </w:p>
-        </w:tc>
-      </w:tr>
-      <w:tr>
-        <w:tc>
-          <w:tcPr>
-            <w:tcW w:type="dxa" w:w="6236"/>
-          </w:tcPr>
           <w:p>
+            <w:pPr>
+              <w:spacing w:before="0" w:after="0" w:line="240" w:lineRule="auto"/>
+            </w:pPr>
             <w:r>
               <w:rPr>
                 <w:b w:val="0"/>
+                <w:caps w:val="0"/>
+                <w:color w:val="1E293B"/>
+                <w:sz w:val="17"/>
               </w:rPr>
-              <w:t>Salud (7% Fonasa o plan Isapre)</w:t>
+              <w:t>______________________</w:t>
             </w:r>
           </w:p>
         </w:tc>
         <w:tc>
           <w:tcPr>
-            <w:tcW w:type="dxa" w:w="3402"/>
+            <w:tcW w:type="dxa" w:w="3475"/>
+            <w:tcBorders>
+              <w:top w:val="nil"/>
+              <w:left w:val="nil"/>
+              <w:bottom w:val="single" w:sz="4" w:color="D7DEE4"/>
+              <w:right w:val="nil"/>
+            </w:tcBorders>
           </w:tcPr>
           <w:p>
             <w:pPr>
-              <w:jc w:val="right"/>
+              <w:spacing w:before="0" w:after="0" w:line="240" w:lineRule="auto"/>
             </w:pPr>
             <w:r>
-              <w:t>$</w:t>
+              <w:rPr>
+                <w:b/>
+                <w:caps/>
+                <w:color w:val="64748B"/>
+                <w:sz w:val="13"/>
+              </w:rPr>
+              <w:t>Fecha de pago</w:t>
             </w:r>
           </w:p>
-        </w:tc>
-      </w:tr>
-      <w:tr>
-        <w:tc>
-          <w:tcPr>
-            <w:tcW w:type="dxa" w:w="6236"/>
-          </w:tcPr>
           <w:p>
+            <w:pPr>
+              <w:spacing w:before="0" w:after="0" w:line="240" w:lineRule="auto"/>
+            </w:pPr>
             <w:r>
               <w:rPr>
                 <w:b w:val="0"/>
+                <w:caps w:val="0"/>
+                <w:color w:val="1E293B"/>
+                <w:sz w:val="17"/>
               </w:rPr>
-              <w:t>Seguro de cesantía (0,6% contrato indefinido)</w:t>
-            </w:r>
-          </w:p>
-        </w:tc>
-        <w:tc>
-          <w:tcPr>
-            <w:tcW w:type="dxa" w:w="3402"/>
-          </w:tcPr>
-          <w:p>
-            <w:pPr>
-              <w:jc w:val="right"/>
-            </w:pPr>
-            <w:r>
-              <w:t>$</w:t>
-            </w:r>
-          </w:p>
-        </w:tc>
-      </w:tr>
-      <w:tr>
-        <w:tc>
-          <w:tcPr>
-            <w:tcW w:type="dxa" w:w="6236"/>
-          </w:tcPr>
-          <w:p>
-            <w:r>
-              <w:rPr>
-                <w:b w:val="0"/>
-              </w:rPr>
-              <w:t>Impuesto único de segunda categoría</w:t>
-            </w:r>
-          </w:p>
-        </w:tc>
-        <w:tc>
-          <w:tcPr>
-            <w:tcW w:type="dxa" w:w="3402"/>
-          </w:tcPr>
-          <w:p>
-            <w:pPr>
-              <w:jc w:val="right"/>
-            </w:pPr>
-            <w:r>
-              <w:t>$</w:t>
-            </w:r>
-          </w:p>
-        </w:tc>
-      </w:tr>
-      <w:tr>
-        <w:tc>
-          <w:tcPr>
-            <w:tcW w:type="dxa" w:w="6236"/>
-          </w:tcPr>
-          <w:p>
-            <w:r>
-              <w:rPr>
-                <w:b w:val="0"/>
-              </w:rPr>
-              <w:t>Anticipos</w:t>
-            </w:r>
-          </w:p>
-        </w:tc>
-        <w:tc>
-          <w:tcPr>
-            <w:tcW w:type="dxa" w:w="3402"/>
-          </w:tcPr>
-          <w:p>
-            <w:pPr>
-              <w:jc w:val="right"/>
-            </w:pPr>
-            <w:r>
-              <w:t>$</w:t>
-            </w:r>
-          </w:p>
-        </w:tc>
-      </w:tr>
-      <w:tr>
-        <w:tc>
-          <w:tcPr>
-            <w:tcW w:type="dxa" w:w="6236"/>
-          </w:tcPr>
-          <w:p>
-            <w:r>
-              <w:rPr>
-                <w:b w:val="0"/>
-              </w:rPr>
-              <w:t>Otros descuentos autorizados</w:t>
-            </w:r>
-          </w:p>
-        </w:tc>
-        <w:tc>
-          <w:tcPr>
-            <w:tcW w:type="dxa" w:w="3402"/>
-          </w:tcPr>
-          <w:p>
-            <w:pPr>
-              <w:jc w:val="right"/>
-            </w:pPr>
-            <w:r>
-              <w:t>$</w:t>
-            </w:r>
-          </w:p>
-        </w:tc>
-      </w:tr>
-      <w:tr>
-        <w:tc>
-          <w:tcPr>
-            <w:tcW w:type="dxa" w:w="6236"/>
-            <w:shd w:val="clear" w:color="auto" w:fill="FFF4D6"/>
-          </w:tcPr>
-          <w:p>
-            <w:r>
-              <w:rPr>
-                <w:b/>
-              </w:rPr>
-              <w:t>TOTAL DESCUENTOS</w:t>
-            </w:r>
-          </w:p>
-        </w:tc>
-        <w:tc>
-          <w:tcPr>
-            <w:tcW w:type="dxa" w:w="3402"/>
-            <w:shd w:val="clear" w:color="auto" w:fill="FFF4D6"/>
-          </w:tcPr>
-          <w:p>
-            <w:pPr>
-              <w:jc w:val="right"/>
-            </w:pPr>
-            <w:r>
-              <w:t>$</w:t>
+              <w:t>____ / ____ / ________</w:t>
             </w:r>
           </w:p>
         </w:tc>
@@ -926,151 +2726,161 @@
     </w:tbl>
     <w:p>
       <w:pPr>
-        <w:spacing w:before="160" w:after="40"/>
+        <w:spacing w:before="0" w:after="0" w:line="200" w:lineRule="exact"/>
       </w:pPr>
       <w:r>
         <w:rPr>
-          <w:b/>
-          <w:color w:val="00382E"/>
-          <w:sz w:val="19"/>
+          <w:sz w:val="2"/>
         </w:rPr>
-        <w:t>RESULTADO</w:t>
+      </w:r>
+    </w:p>
+    <w:p>
+      <w:pPr>
+        <w:spacing w:after="0"/>
+      </w:pPr>
+      <w:r>
+        <w:rPr>
+          <w:color w:val="64748B"/>
+          <w:sz w:val="15"/>
+        </w:rPr>
+        <w:t>Certifico que he recibido de mi empleador, a mi entera satisfacción, el líquido a pagar indicado en esta liquidación y que no tengo cargo ni cobro alguno que hacer por los conceptos que comprende.</w:t>
+      </w:r>
+    </w:p>
+    <w:p>
+      <w:pPr>
+        <w:spacing w:before="0" w:after="0" w:line="880" w:lineRule="exact"/>
+      </w:pPr>
+      <w:r>
+        <w:rPr>
+          <w:sz w:val="2"/>
+        </w:rPr>
       </w:r>
     </w:p>
     <w:tbl>
       <w:tblPr>
-        <w:tblStyle w:val="TableGrid"/>
         <w:tblW w:type="auto" w:w="0"/>
-        <w:jc w:val="center"/>
         <w:tblLook w:firstColumn="1" w:firstRow="1" w:lastColumn="0" w:lastRow="0" w:noHBand="0" w:noVBand="1" w:val="04A0"/>
+        <w:tblBorders>
+          <w:top w:val="nil"/>
+          <w:left w:val="nil"/>
+          <w:bottom w:val="nil"/>
+          <w:right w:val="nil"/>
+          <w:insideH w:val="nil"/>
+          <w:insideV w:val="nil"/>
+        </w:tblBorders>
+        <w:tblLayout w:type="fixed"/>
+        <w:tblCellMar>
+          <w:top w:w="40" w:type="dxa"/>
+          <w:left w:w="0" w:type="dxa"/>
+          <w:bottom w:w="0" w:type="dxa"/>
+          <w:right w:w="0" w:type="dxa"/>
+        </w:tblCellMar>
+        <w:tblLayout w:type="fixed"/>
       </w:tblPr>
       <w:tblGrid>
-        <w:gridCol w:w="4986"/>
-        <w:gridCol w:w="4986"/>
+        <w:gridCol w:w="4309"/>
+        <w:gridCol w:w="1809"/>
+        <w:gridCol w:w="4309"/>
       </w:tblGrid>
       <w:tr>
         <w:tc>
           <w:tcPr>
-            <w:tcW w:type="dxa" w:w="6236"/>
-            <w:shd w:val="clear" w:color="auto" w:fill="FFF4D6"/>
+            <w:tcW w:type="dxa" w:w="4309"/>
+            <w:tcBorders>
+              <w:top w:val="single" w:sz="6" w:color="1E293B"/>
+              <w:left w:val="nil"/>
+              <w:bottom w:val="nil"/>
+              <w:right w:val="nil"/>
+            </w:tcBorders>
           </w:tcPr>
           <w:p>
+            <w:pPr>
+              <w:spacing w:before="0" w:after="0" w:line="240" w:lineRule="auto"/>
+              <w:jc w:val="center"/>
+            </w:pPr>
             <w:r>
               <w:rPr>
-                <w:b/>
+                <w:b w:val="0"/>
+                <w:caps w:val="0"/>
+                <w:color w:val="64748B"/>
+                <w:sz w:val="15"/>
               </w:rPr>
-              <w:t>ALCANCE LÍQUIDO A PAGAR</w:t>
+              <w:t>Firma y timbre del empleador</w:t>
             </w:r>
           </w:p>
         </w:tc>
         <w:tc>
           <w:tcPr>
-            <w:tcW w:type="dxa" w:w="3402"/>
-            <w:shd w:val="clear" w:color="auto" w:fill="FFF4D6"/>
+            <w:tcW w:type="dxa" w:w="1809"/>
           </w:tcPr>
           <w:p>
             <w:pPr>
-              <w:jc w:val="right"/>
+              <w:spacing w:before="0" w:after="0" w:line="240" w:lineRule="auto"/>
             </w:pPr>
             <w:r>
-              <w:t>$</w:t>
-            </w:r>
-          </w:p>
-        </w:tc>
-      </w:tr>
-    </w:tbl>
-    <w:p/>
-    <w:p>
-      <w:r>
-        <w:rPr>
-          <w:sz w:val="18"/>
-        </w:rPr>
-        <w:t>Certifico que he recibido de mi empleador, a mi entera satisfacción, el alcance líquido de la presente liquidación y que no tengo cargo ni cobro alguno que hacer por los conceptos que comprende.</w:t>
-      </w:r>
-    </w:p>
-    <w:p/>
-    <w:p/>
-    <w:tbl>
-      <w:tblPr>
-        <w:tblW w:type="auto" w:w="0"/>
-        <w:jc w:val="center"/>
-        <w:tblLook w:firstColumn="1" w:firstRow="1" w:lastColumn="0" w:lastRow="0" w:noHBand="0" w:noVBand="1" w:val="04A0"/>
-      </w:tblPr>
-      <w:tblGrid>
-        <w:gridCol w:w="4986"/>
-        <w:gridCol w:w="4986"/>
-      </w:tblGrid>
-      <w:tr>
-        <w:tc>
-          <w:tcPr>
-            <w:tcW w:type="dxa" w:w="4986"/>
-          </w:tcPr>
-          <w:p>
-            <w:pPr>
-              <w:jc w:val="center"/>
-            </w:pPr>
-            <w:r>
-              <w:t>______________________________</w:t>
+              <w:rPr>
+                <w:b w:val="0"/>
+                <w:caps w:val="0"/>
+                <w:color w:val="1E293B"/>
+                <w:sz w:val="17"/>
+              </w:rPr>
             </w:r>
           </w:p>
         </w:tc>
         <w:tc>
           <w:tcPr>
-            <w:tcW w:type="dxa" w:w="4986"/>
+            <w:tcW w:type="dxa" w:w="4309"/>
+            <w:tcBorders>
+              <w:top w:val="single" w:sz="6" w:color="1E293B"/>
+              <w:left w:val="nil"/>
+              <w:bottom w:val="nil"/>
+              <w:right w:val="nil"/>
+            </w:tcBorders>
           </w:tcPr>
           <w:p>
             <w:pPr>
+              <w:spacing w:before="0" w:after="0" w:line="240" w:lineRule="auto"/>
               <w:jc w:val="center"/>
             </w:pPr>
             <w:r>
-              <w:t>______________________________</w:t>
-            </w:r>
-          </w:p>
-        </w:tc>
-      </w:tr>
-      <w:tr>
-        <w:tc>
-          <w:tcPr>
-            <w:tcW w:type="dxa" w:w="4986"/>
-          </w:tcPr>
-          <w:p>
-            <w:pPr>
-              <w:jc w:val="center"/>
-            </w:pPr>
-            <w:r>
-              <w:t>Firma del empleador</w:t>
-            </w:r>
-          </w:p>
-        </w:tc>
-        <w:tc>
-          <w:tcPr>
-            <w:tcW w:type="dxa" w:w="4986"/>
-          </w:tcPr>
-          <w:p>
-            <w:pPr>
-              <w:jc w:val="center"/>
-            </w:pPr>
-            <w:r>
+              <w:rPr>
+                <w:b w:val="0"/>
+                <w:caps w:val="0"/>
+                <w:color w:val="64748B"/>
+                <w:sz w:val="15"/>
+              </w:rPr>
               <w:t>Firma del trabajador</w:t>
             </w:r>
           </w:p>
         </w:tc>
       </w:tr>
     </w:tbl>
-    <w:p/>
     <w:p>
+      <w:pPr>
+        <w:spacing w:before="0" w:after="0" w:line="280" w:lineRule="exact"/>
+      </w:pPr>
+      <w:r>
+        <w:rPr>
+          <w:sz w:val="2"/>
+        </w:rPr>
+      </w:r>
+    </w:p>
+    <w:p>
+      <w:pPr>
+        <w:jc w:val="center"/>
+      </w:pPr>
       <w:r>
         <w:rPr>
           <w:i/>
-          <w:color w:val="475569"/>
-          <w:sz w:val="16"/>
+          <w:color w:val="64748B"/>
+          <w:sz w:val="13"/>
         </w:rPr>
-        <w:t>Formato gratuito de calculolaboral.cl/liquidacion-de-sueldo. Es un modelo de referencia: los montos dependen de tu contrato, tu AFP y tu sistema de salud. Puedes calcular los tuyos en calculolaboral.cl/sueldo_liquido.</w:t>
+        <w:t>Formato gratuito de calculolaboral.cl/liquidacion-de-sueldo. Es un modelo de referencia: los montos dependen del contrato, la AFP y el sistema de salud de cada trabajador.</w:t>
       </w:r>
     </w:p>
     <w:sectPr>
       <w:pgSz w:w="12240" w:h="15840"/>
-      <w:pgMar w:top="1020" w:right="1134" w:bottom="1020" w:left="1134" w:header="720" w:footer="720" w:gutter="0"/>
+      <w:pgMar w:top="794" w:right="907" w:bottom="794" w:left="907" w:header="720" w:footer="720" w:gutter="0"/>
       <w:cols w:space="720"/>
       <w:docGrid w:linePitch="360"/>
     </w:sectPr>
@@ -1441,9 +3251,12 @@
     <w:name w:val="Normal"/>
     <w:qFormat/>
     <w:rsid w:val="00FC693F"/>
+    <w:pPr>
+      <w:spacing w:after="0"/>
+    </w:pPr>
     <w:rPr>
-      <w:rFonts w:ascii="Calibri" w:hAnsi="Calibri"/>
-      <w:sz w:val="20"/>
+      <w:rFonts w:ascii="Arial" w:hAnsi="Arial" w:eastAsia="Arial"/>
+      <w:sz w:val="17"/>
     </w:rPr>
   </w:style>
   <w:style w:type="paragraph" w:styleId="Header">

</xml_diff>

<commit_message>
fix(liquidacion): recuadro del liquido a pagar apto para imprimir en blanco y negro
El fondo verde oscuro gastaba tinta y en blanco y negro quedaba como un bloque
gris. Ahora el recuadro (Word y Excel) tiene fondo casi blanco, borde grueso
oscuro y el monto en negro.

Co-Authored-By: Claude Opus 5.5 <noreply@anthropic.com>
Claude-Session: https://claude.ai/code/session_01WLXjYYN7g49YRmmeLkdTX3
</commit_message>
<xml_diff>
--- a/descargas/formato-liquidacion-de-sueldo.docx
+++ b/descargas/formato-liquidacion-de-sueldo.docx
@@ -2521,7 +2521,13 @@
         <w:tc>
           <w:tcPr>
             <w:tcW w:type="dxa" w:w="4983"/>
-            <w:shd w:val="clear" w:color="auto" w:fill="00382E"/>
+            <w:shd w:val="clear" w:color="auto" w:fill="F4F6F5"/>
+            <w:tcBorders>
+              <w:top w:val="single" w:sz="24" w:color="1E293B"/>
+              <w:left w:val="single" w:sz="24" w:color="1E293B"/>
+              <w:bottom w:val="single" w:sz="24" w:color="1E293B"/>
+              <w:right w:val="single" w:sz="24" w:color="1E293B"/>
+            </w:tcBorders>
           </w:tcPr>
           <w:p>
             <w:pPr>
@@ -2531,8 +2537,8 @@
               <w:rPr>
                 <w:b/>
                 <w:caps/>
-                <w:color w:val="FFB703"/>
-                <w:sz w:val="14"/>
+                <w:color w:val="1E293B"/>
+                <w:sz w:val="15"/>
               </w:rPr>
               <w:t>Líquido a pagar</w:t>
             </w:r>
@@ -2545,7 +2551,7 @@
               <w:rPr>
                 <w:b/>
                 <w:caps w:val="0"/>
-                <w:color w:val="FFFFFF"/>
+                <w:color w:val="000000"/>
                 <w:sz w:val="36"/>
               </w:rPr>
               <w:t>$</w:t>
@@ -2559,7 +2565,7 @@
               <w:rPr>
                 <w:b w:val="0"/>
                 <w:caps w:val="0"/>
-                <w:color w:val="D9E6E3"/>
+                <w:color w:val="1E293B"/>
                 <w:sz w:val="15"/>
               </w:rPr>
               <w:t>Son: _______________________________ pesos</w:t>

</xml_diff>